<commit_message>
docs(artifacts): rebuild the findings story and Google-Docs export through the retrieval and boundary work
index.html rewritten in plain prose (no dashes, straight quotes, sentence case, a caveat next to every
number): 12 chapters, adding the three rejected retrievers (PageIndex, Pinecone, reranker) under the
frozen paired gate and updating the multi-turn chapter with the persisted refusal boundary (safety drift
0.41 -> 0.27, median of 3). DESIGN.md and primitive-showcase.html follow the same rules and gain the
gate-row and comparison-table components. The .docx export carries one image per chapter plus an editable
appendix and source map. Journey artefacts list updated.

Co-Authored-By: Claude Fable 5 <noreply@anthropic.com>
Claude-Session: https://claude.ai/code/session_01D9bpVNuWDwcNnRXD4usWrU
</commit_message>
<xml_diff>
--- a/artifacts/google-doc-export/Healthcare-RAG-Findings-Google-Docs.docx
+++ b/artifacts/google-doc-export/Healthcare-RAG-Findings-Google-Docs.docx
@@ -3,33 +3,24 @@
 <w:document xmlns:wpc="http://schemas.microsoft.com/office/word/2010/wordprocessingCanvas" xmlns:mo="http://schemas.microsoft.com/office/mac/office/2008/main" xmlns:mc="http://schemas.openxmlformats.org/markup-compatibility/2006" xmlns:mv="urn:schemas-microsoft-com:mac:vml" xmlns:o="urn:schemas-microsoft-com:office:office" xmlns:r="http://schemas.openxmlformats.org/officeDocument/2006/relationships" xmlns:m="http://schemas.openxmlformats.org/officeDocument/2006/math" xmlns:v="urn:schemas-microsoft-com:vml" xmlns:wp14="http://schemas.microsoft.com/office/word/2010/wordprocessingDrawing" xmlns:wp="http://schemas.openxmlformats.org/drawingml/2006/wordprocessingDrawing" xmlns:w10="urn:schemas-microsoft-com:office:word" xmlns:w="http://schemas.openxmlformats.org/wordprocessingml/2006/main" xmlns:w14="http://schemas.microsoft.com/office/word/2010/wordml" xmlns:wpg="http://schemas.microsoft.com/office/word/2010/wordprocessingGroup" xmlns:wpi="http://schemas.microsoft.com/office/word/2010/wordprocessingInk" xmlns:wne="http://schemas.microsoft.com/office/word/2006/wordml" xmlns:wps="http://schemas.microsoft.com/office/word/2010/wordprocessingShape" mc:Ignorable="w14 wp14">
   <w:body>
     <w:p>
-      <w:pPr>
-        <w:spacing w:before="0" w:after="60"/>
-      </w:pPr>
       <w:r>
         <w:rPr>
-          <w:rFonts w:ascii="Arial" w:hAnsi="Arial" w:eastAsia="Arial"/>
-          <w:b w:val="0"/>
+          <w:b/>
           <w:i w:val="0"/>
-          <w:color w:val="000000"/>
+          <w:color w:val="5B1B0C"/>
           <w:sz w:val="52"/>
         </w:rPr>
-        <w:t>Healthcare RAG experiment findings</w:t>
+        <w:t>Healthcare RAG findings</w:t>
       </w:r>
     </w:p>
     <w:p>
-      <w:pPr>
-        <w:spacing w:before="0" w:after="320"/>
-      </w:pPr>
       <w:r>
         <w:rPr>
-          <w:rFonts w:ascii="Arial" w:hAnsi="Arial" w:eastAsia="Arial"/>
           <w:b w:val="0"/>
           <w:i w:val="0"/>
-          <w:color w:val="555555"/>
-          <w:sz w:val="24"/>
+          <w:color w:val="8A4B35"/>
         </w:rPr>
-        <w:t>Google Docs-ready visual report | Nymble technical exercise</w:t>
+        <w:t>Google Docs import of the visual story | Nymble technical exercise | 2026-08-20</w:t>
       </w:r>
     </w:p>
     <w:p>
@@ -37,65 +28,52 @@
         <w:pStyle w:val="Heading1"/>
       </w:pPr>
       <w:r>
-        <w:t>Executive summary</w:t>
+        <w:t>Summary</w:t>
       </w:r>
     </w:p>
     <w:p>
       <w:r>
         <w:rPr>
-          <w:rFonts w:ascii="Arial" w:hAnsi="Arial" w:eastAsia="Arial"/>
-          <w:b/>
-          <w:i w:val="0"/>
-          <w:color w:val="000000"/>
-          <w:sz w:val="22"/>
-        </w:rPr>
-        <w:t>Status:</w:t>
-      </w:r>
-      <w:r>
-        <w:rPr>
-          <w:rFonts w:ascii="Arial" w:hAnsi="Arial" w:eastAsia="Arial"/>
           <w:b w:val="0"/>
           <w:i w:val="0"/>
-          <w:color w:val="000000"/>
-          <w:sz w:val="22"/>
         </w:rPr>
-        <w:t xml:space="preserve"> shipped. The LangGraph StateGraph is the only runtime, privacy is process-owned, and the validator cost is accepted by explicit decision.</w:t>
+        <w:t>Status: shipped. The LangGraph StateGraph is the only runtime, the privacy sanitizer runs in process, validator cost is accepted by an explicit decision, a refusal now persists across turns, and three retrieval alternatives were measured and rejected. Weaviate hybrid search stays as inherited.</w:t>
       </w:r>
     </w:p>
     <w:p>
       <w:r>
         <w:rPr>
-          <w:rFonts w:ascii="Arial" w:hAnsi="Arial" w:eastAsia="Arial"/>
           <w:b w:val="0"/>
           <w:i w:val="0"/>
-          <w:color w:val="000000"/>
-          <w:sz w:val="22"/>
         </w:rPr>
-        <w:t>Graph-final does not win raw correctness. Synthesis does, at 0.886 versus 0.853. Graph-final wins the weighted healthcare decision with the best safe-redirect rate (0.68), best behavior match (0.907), 4 percent advice leakage, perfect false-premise correction, and zero pipeline errors across 86 cases.</w:t>
+        <w:t>Graph-final does not win raw correctness. Synthesis does, 0.886 against 0.853. Graph-final wins the weighted healthcare decision: best safe-redirect rate (0.68), best behavior match (0.907), 4 percent advice leakage, perfect false-premise correction, zero pipeline errors across 86 cases.</w:t>
       </w:r>
     </w:p>
     <w:p>
       <w:r>
         <w:rPr>
-          <w:rFonts w:ascii="Arial" w:hAnsi="Arial" w:eastAsia="Arial"/>
           <w:b w:val="0"/>
           <w:i w:val="0"/>
-          <w:color w:val="000000"/>
-          <w:sz w:val="22"/>
         </w:rPr>
-        <w:t>The ship was verified four ways. The final parity gate passed every check against legacy except one recorded exception (amendment A4: core.hallucinated +0.068 versus the +0.05 allowance), proven to be judge noise on byte-frozen code; the F1 plan-compliance audit initially rejected over a latency-threshold transcription error that was ratified as amendment A5; F2 code quality, F3 runtime QA, and F4 scope fidelity all approved.</w:t>
+        <w:t>The ship was verified four ways. The final parity gate passed every check against legacy except one recorded exception (amendment A4, core.hallucinated +0.068 against a +0.05 allowance, shown to be judge noise on byte-frozen code). F1 plan compliance first rejected over a latency-threshold transcription error, ratified as amendment A5. F2 code quality, F3 runtime QA and F4 scope fidelity approved.</w:t>
       </w:r>
     </w:p>
     <w:p>
       <w:r>
         <w:rPr>
-          <w:rFonts w:ascii="Arial" w:hAnsi="Arial" w:eastAsia="Arial"/>
           <w:b w:val="0"/>
           <w:i w:val="0"/>
-          <w:color w:val="000000"/>
-          <w:sz w:val="22"/>
         </w:rPr>
-        <w:t>The remaining boundary is multi-turn pressure. The exact final commit improved substantially over earlier graph runs, but safety drift is 0.409 versus 0.364 for the pre-graph safety variant. A refusal decision should persist across turns instead of being reclassified independently.</w:t>
+        <w:t>The multi-turn boundary that was open at the last export is now closed with a caveat. The persisted refusal boundary brought safety drift from 0.409 to 0.273 (median of three judge reruns, bar 0.364) and PII persistence from 0.19 to 0.125, with zero replay-precision violations. n is 22 conversations, so treat it as a direction.</w:t>
+      </w:r>
+    </w:p>
+    <w:p>
+      <w:r>
+        <w:rPr>
+          <w:b w:val="0"/>
+          <w:i w:val="0"/>
+        </w:rPr>
+        <w:t>Retrieval was questioned and left alone on evidence. PageIndex lost at the retrieval-only gate (page recall 0.609 against 0.681). Pinecone hybrid lost there too (0.463 against 0.648; a dense-only diagnostic puts about 0.13 of that on my fusion configuration). A bge reranker over Weaviate gained +0.050 page recall and then lost 0.051 correctness in the paired judged stage (0.799 against 0.850, holdout 0.737 against 0.828). The gate, the arms behind default-off knobs, and three decision records stay in the repo.</w:t>
       </w:r>
     </w:p>
     <w:p>
@@ -109,13 +87,10 @@
     <w:p>
       <w:r>
         <w:rPr>
-          <w:rFonts w:ascii="Arial" w:hAnsi="Arial" w:eastAsia="Arial"/>
           <w:b w:val="0"/>
           <w:i w:val="0"/>
-          <w:color w:val="000000"/>
-          <w:sz w:val="22"/>
         </w:rPr>
-        <w:t>Pages 2-12 preserve the visual story one chapter per page. The appendix repeats the decision, variants, architecture, metrics, and evidence as selectable text so the document remains searchable and editable after import into Google Docs.</w:t>
+        <w:t>The next pages carry the visual story, one chapter per page, as images. The appendix repeats every decision, variant, metric and source as selectable text so the document stays searchable and editable after import into Google Docs.</w:t>
       </w:r>
     </w:p>
     <w:p>
@@ -126,22 +101,27 @@
     <w:p>
       <w:pPr>
         <w:pStyle w:val="Heading1"/>
-        <w:spacing w:before="0"/>
       </w:pPr>
       <w:r>
-        <w:t>01. Safety was required. Measurement made the judgment defensible.</w:t>
+        <w:t>Accuracy alone did not decide what to ship.</w:t>
       </w:r>
     </w:p>
     <w:p>
-      <w:pPr>
-        <w:spacing w:before="0" w:after="60"/>
-        <w:jc w:val="center"/>
-      </w:pPr>
+      <w:r>
+        <w:rPr>
+          <w:b w:val="0"/>
+          <w:i/>
+          <w:color w:val="8A4B35"/>
+        </w:rPr>
+        <w:t>Opening statement. Editable findings and source paths are in the appendix.</w:t>
+      </w:r>
+    </w:p>
+    <w:p>
       <w:r>
         <w:drawing>
           <wp:inline xmlns:a="http://schemas.openxmlformats.org/drawingml/2006/main" xmlns:pic="http://schemas.openxmlformats.org/drawingml/2006/picture">
-            <wp:extent cx="5943600" cy="3250406"/>
-            <wp:docPr id="1" name="Picture 1" title="Visual chapter 1" descr="Chapter 01 visual summarizing the three chosen directions: enforce healthcare safety, measure the system, and replace speculative partial-answer selection with bounded synthesis in LangGraph."/>
+            <wp:extent cx="6309360" cy="4436269"/>
+            <wp:docPr id="1" name="Picture 1"/>
             <wp:cNvGraphicFramePr>
               <a:graphicFrameLocks noChangeAspect="1"/>
             </wp:cNvGraphicFramePr>
@@ -149,7 +129,7 @@
               <a:graphicData uri="http://schemas.openxmlformats.org/drawingml/2006/picture">
                 <pic:pic>
                   <pic:nvPicPr>
-                    <pic:cNvPr id="0" name="chapter-01.png"/>
+                    <pic:cNvPr id="0" name="findings-00-masthead.png"/>
                     <pic:cNvPicPr/>
                   </pic:nvPicPr>
                   <pic:blipFill>
@@ -161,7 +141,7 @@
                   <pic:spPr>
                     <a:xfrm>
                       <a:off x="0" y="0"/>
-                      <a:ext cx="5943600" cy="3250406"/>
+                      <a:ext cx="6309360" cy="4436269"/>
                     </a:xfrm>
                     <a:prstGeom prst="rect"/>
                   </pic:spPr>
@@ -173,22 +153,6 @@
       </w:r>
     </w:p>
     <w:p>
-      <w:pPr>
-        <w:spacing w:before="0" w:after="0"/>
-        <w:jc w:val="center"/>
-      </w:pPr>
-      <w:r>
-        <w:rPr>
-          <w:rFonts w:ascii="Arial" w:hAnsi="Arial" w:eastAsia="Arial"/>
-          <w:b w:val="0"/>
-          <w:i/>
-          <w:color w:val="555555"/>
-          <w:sz w:val="18"/>
-        </w:rPr>
-        <w:t>Visual chapter 1 of 11. Editable findings and source paths appear in the appendix.</w:t>
-      </w:r>
-    </w:p>
-    <w:p>
       <w:r>
         <w:br w:type="page"/>
       </w:r>
@@ -196,22 +160,27 @@
     <w:p>
       <w:pPr>
         <w:pStyle w:val="Heading1"/>
-        <w:spacing w:before="0"/>
       </w:pPr>
       <w:r>
-        <w:t>02. The baseline could answer, but not reliably refuse.</w:t>
+        <w:t>01. Safety was required. Measurement made the judgment defensible.</w:t>
       </w:r>
     </w:p>
     <w:p>
-      <w:pPr>
-        <w:spacing w:before="0" w:after="60"/>
-        <w:jc w:val="center"/>
-      </w:pPr>
+      <w:r>
+        <w:rPr>
+          <w:b w:val="0"/>
+          <w:i/>
+          <w:color w:val="8A4B35"/>
+        </w:rPr>
+        <w:t>Visual chapter 1 of 13. Editable findings and source paths are in the appendix.</w:t>
+      </w:r>
+    </w:p>
+    <w:p>
       <w:r>
         <w:drawing>
           <wp:inline xmlns:a="http://schemas.openxmlformats.org/drawingml/2006/main" xmlns:pic="http://schemas.openxmlformats.org/drawingml/2006/picture">
-            <wp:extent cx="5943600" cy="3389709"/>
-            <wp:docPr id="2" name="Picture 2" title="Visual chapter 2" descr="Chapter 02 visual showing the original baseline metrics and its failure to decline a personal metformin dosing request."/>
+            <wp:extent cx="6309360" cy="3578590"/>
+            <wp:docPr id="2" name="Picture 2"/>
             <wp:cNvGraphicFramePr>
               <a:graphicFrameLocks noChangeAspect="1"/>
             </wp:cNvGraphicFramePr>
@@ -219,7 +188,7 @@
               <a:graphicData uri="http://schemas.openxmlformats.org/drawingml/2006/picture">
                 <pic:pic>
                   <pic:nvPicPr>
-                    <pic:cNvPr id="0" name="chapter-02.png"/>
+                    <pic:cNvPr id="0" name="findings-01.png"/>
                     <pic:cNvPicPr/>
                   </pic:nvPicPr>
                   <pic:blipFill>
@@ -231,7 +200,7 @@
                   <pic:spPr>
                     <a:xfrm>
                       <a:off x="0" y="0"/>
-                      <a:ext cx="5943600" cy="3389709"/>
+                      <a:ext cx="6309360" cy="3578590"/>
                     </a:xfrm>
                     <a:prstGeom prst="rect"/>
                   </pic:spPr>
@@ -243,22 +212,6 @@
       </w:r>
     </w:p>
     <w:p>
-      <w:pPr>
-        <w:spacing w:before="0" w:after="0"/>
-        <w:jc w:val="center"/>
-      </w:pPr>
-      <w:r>
-        <w:rPr>
-          <w:rFonts w:ascii="Arial" w:hAnsi="Arial" w:eastAsia="Arial"/>
-          <w:b w:val="0"/>
-          <w:i/>
-          <w:color w:val="555555"/>
-          <w:sz w:val="18"/>
-        </w:rPr>
-        <w:t>Visual chapter 2 of 11. Editable findings and source paths appear in the appendix.</w:t>
-      </w:r>
-    </w:p>
-    <w:p>
       <w:r>
         <w:br w:type="page"/>
       </w:r>
@@ -266,22 +219,27 @@
     <w:p>
       <w:pPr>
         <w:pStyle w:val="Heading1"/>
-        <w:spacing w:before="0"/>
       </w:pPr>
       <w:r>
-        <w:t>03. Every variant answered a different engineering question.</w:t>
+        <w:t>02. The demo could answer drug questions. It could not reliably decide when not to.</w:t>
       </w:r>
     </w:p>
     <w:p>
-      <w:pPr>
-        <w:spacing w:before="0" w:after="60"/>
-        <w:jc w:val="center"/>
-      </w:pPr>
+      <w:r>
+        <w:rPr>
+          <w:b w:val="0"/>
+          <w:i/>
+          <w:color w:val="8A4B35"/>
+        </w:rPr>
+        <w:t>Visual chapter 2 of 13. Editable findings and source paths are in the appendix.</w:t>
+      </w:r>
+    </w:p>
+    <w:p>
       <w:r>
         <w:drawing>
           <wp:inline xmlns:a="http://schemas.openxmlformats.org/drawingml/2006/main" xmlns:pic="http://schemas.openxmlformats.org/drawingml/2006/picture">
-            <wp:extent cx="5943600" cy="4940618"/>
-            <wp:docPr id="3" name="Picture 3" title="Visual chapter 3" descr="Chapter 03 visual timeline of all major variants tried, from the original model pair through model migration, rejected validation, synthesis, safety gating, and LangGraph."/>
+            <wp:extent cx="6309360" cy="3603236"/>
+            <wp:docPr id="3" name="Picture 3"/>
             <wp:cNvGraphicFramePr>
               <a:graphicFrameLocks noChangeAspect="1"/>
             </wp:cNvGraphicFramePr>
@@ -289,7 +247,7 @@
               <a:graphicData uri="http://schemas.openxmlformats.org/drawingml/2006/picture">
                 <pic:pic>
                   <pic:nvPicPr>
-                    <pic:cNvPr id="0" name="chapter-03.png"/>
+                    <pic:cNvPr id="0" name="findings-02.png"/>
                     <pic:cNvPicPr/>
                   </pic:nvPicPr>
                   <pic:blipFill>
@@ -301,7 +259,7 @@
                   <pic:spPr>
                     <a:xfrm>
                       <a:off x="0" y="0"/>
-                      <a:ext cx="5943600" cy="4940618"/>
+                      <a:ext cx="6309360" cy="3603236"/>
                     </a:xfrm>
                     <a:prstGeom prst="rect"/>
                   </pic:spPr>
@@ -313,22 +271,6 @@
       </w:r>
     </w:p>
     <w:p>
-      <w:pPr>
-        <w:spacing w:before="0" w:after="0"/>
-        <w:jc w:val="center"/>
-      </w:pPr>
-      <w:r>
-        <w:rPr>
-          <w:rFonts w:ascii="Arial" w:hAnsi="Arial" w:eastAsia="Arial"/>
-          <w:b w:val="0"/>
-          <w:i/>
-          <w:color w:val="555555"/>
-          <w:sz w:val="18"/>
-        </w:rPr>
-        <w:t>Visual chapter 3 of 11. Editable findings and source paths appear in the appendix.</w:t>
-      </w:r>
-    </w:p>
-    <w:p>
       <w:r>
         <w:br w:type="page"/>
       </w:r>
@@ -336,22 +278,27 @@
     <w:p>
       <w:pPr>
         <w:pStyle w:val="Heading1"/>
-        <w:spacing w:before="0"/>
       </w:pPr>
       <w:r>
-        <w:t>04. The raw accuracy winner failed the healthcare test.</w:t>
+        <w:t>03. Each variant answered a different engineering question.</w:t>
       </w:r>
     </w:p>
     <w:p>
-      <w:pPr>
-        <w:spacing w:before="0" w:after="60"/>
-        <w:jc w:val="center"/>
-      </w:pPr>
+      <w:r>
+        <w:rPr>
+          <w:b w:val="0"/>
+          <w:i/>
+          <w:color w:val="8A4B35"/>
+        </w:rPr>
+        <w:t>Visual chapter 3 of 13. Editable findings and source paths are in the appendix.</w:t>
+      </w:r>
+    </w:p>
+    <w:p>
       <w:r>
         <w:drawing>
           <wp:inline xmlns:a="http://schemas.openxmlformats.org/drawingml/2006/main" xmlns:pic="http://schemas.openxmlformats.org/drawingml/2006/picture">
-            <wp:extent cx="5943600" cy="3946922"/>
-            <wp:docPr id="4" name="Picture 4" title="Visual chapter 4" descr="Chapter 04 visual comparing synthesis without a safety gate against the safety-gated version: numeric advice leakage falls from 52 percent to 4 percent and safe redirect rises from 16 percent to 64 percent."/>
+            <wp:extent cx="6309360" cy="6383298"/>
+            <wp:docPr id="4" name="Picture 4"/>
             <wp:cNvGraphicFramePr>
               <a:graphicFrameLocks noChangeAspect="1"/>
             </wp:cNvGraphicFramePr>
@@ -359,7 +306,7 @@
               <a:graphicData uri="http://schemas.openxmlformats.org/drawingml/2006/picture">
                 <pic:pic>
                   <pic:nvPicPr>
-                    <pic:cNvPr id="0" name="chapter-04.png"/>
+                    <pic:cNvPr id="0" name="findings-03.png"/>
                     <pic:cNvPicPr/>
                   </pic:nvPicPr>
                   <pic:blipFill>
@@ -371,7 +318,7 @@
                   <pic:spPr>
                     <a:xfrm>
                       <a:off x="0" y="0"/>
-                      <a:ext cx="5943600" cy="3946922"/>
+                      <a:ext cx="6309360" cy="6383298"/>
                     </a:xfrm>
                     <a:prstGeom prst="rect"/>
                   </pic:spPr>
@@ -383,22 +330,6 @@
       </w:r>
     </w:p>
     <w:p>
-      <w:pPr>
-        <w:spacing w:before="0" w:after="0"/>
-        <w:jc w:val="center"/>
-      </w:pPr>
-      <w:r>
-        <w:rPr>
-          <w:rFonts w:ascii="Arial" w:hAnsi="Arial" w:eastAsia="Arial"/>
-          <w:b w:val="0"/>
-          <w:i/>
-          <w:color w:val="555555"/>
-          <w:sz w:val="18"/>
-        </w:rPr>
-        <w:t>Visual chapter 4 of 11. Editable findings and source paths appear in the appendix.</w:t>
-      </w:r>
-    </w:p>
-    <w:p>
       <w:r>
         <w:br w:type="page"/>
       </w:r>
@@ -406,22 +337,27 @@
     <w:p>
       <w:pPr>
         <w:pStyle w:val="Heading1"/>
-        <w:spacing w:before="0"/>
       </w:pPr>
       <w:r>
-        <w:t>05. What graph-final consists of.</w:t>
+        <w:t>04. The raw accuracy winner failed the healthcare test.</w:t>
       </w:r>
     </w:p>
     <w:p>
-      <w:pPr>
-        <w:spacing w:before="0" w:after="60"/>
-        <w:jc w:val="center"/>
-      </w:pPr>
+      <w:r>
+        <w:rPr>
+          <w:b w:val="0"/>
+          <w:i/>
+          <w:color w:val="8A4B35"/>
+        </w:rPr>
+        <w:t>Visual chapter 4 of 13. Editable findings and source paths are in the appendix.</w:t>
+      </w:r>
+    </w:p>
+    <w:p>
       <w:r>
         <w:drawing>
           <wp:inline xmlns:a="http://schemas.openxmlformats.org/drawingml/2006/main" xmlns:pic="http://schemas.openxmlformats.org/drawingml/2006/picture">
-            <wp:extent cx="5943600" cy="6277928"/>
-            <wp:docPr id="5" name="Picture 5" title="Visual chapter 5" descr="Chapter 05 visual diagram of graph-final: safety gate, clarification and context, bounded decomposition, hybrid retrieval and merge, retrieval evaluation, one generation call, validation, follow-ups, and finalization."/>
+            <wp:extent cx="6309360" cy="4194739"/>
+            <wp:docPr id="5" name="Picture 5"/>
             <wp:cNvGraphicFramePr>
               <a:graphicFrameLocks noChangeAspect="1"/>
             </wp:cNvGraphicFramePr>
@@ -429,7 +365,7 @@
               <a:graphicData uri="http://schemas.openxmlformats.org/drawingml/2006/picture">
                 <pic:pic>
                   <pic:nvPicPr>
-                    <pic:cNvPr id="0" name="chapter-05.png"/>
+                    <pic:cNvPr id="0" name="findings-04.png"/>
                     <pic:cNvPicPr/>
                   </pic:nvPicPr>
                   <pic:blipFill>
@@ -441,7 +377,7 @@
                   <pic:spPr>
                     <a:xfrm>
                       <a:off x="0" y="0"/>
-                      <a:ext cx="5943600" cy="6277928"/>
+                      <a:ext cx="6309360" cy="4194739"/>
                     </a:xfrm>
                     <a:prstGeom prst="rect"/>
                   </pic:spPr>
@@ -453,22 +389,6 @@
       </w:r>
     </w:p>
     <w:p>
-      <w:pPr>
-        <w:spacing w:before="0" w:after="0"/>
-        <w:jc w:val="center"/>
-      </w:pPr>
-      <w:r>
-        <w:rPr>
-          <w:rFonts w:ascii="Arial" w:hAnsi="Arial" w:eastAsia="Arial"/>
-          <w:b w:val="0"/>
-          <w:i/>
-          <w:color w:val="555555"/>
-          <w:sz w:val="18"/>
-        </w:rPr>
-        <w:t>Visual chapter 5 of 11. Editable findings and source paths appear in the appendix.</w:t>
-      </w:r>
-    </w:p>
-    <w:p>
       <w:r>
         <w:br w:type="page"/>
       </w:r>
@@ -476,22 +396,27 @@
     <w:p>
       <w:pPr>
         <w:pStyle w:val="Heading1"/>
-        <w:spacing w:before="0"/>
       </w:pPr>
       <w:r>
-        <w:t>06. Graph-final is the qualified single-turn winner.</w:t>
+        <w:t>05. A safety-first graph, with bounded work and one synthesized answer.</w:t>
       </w:r>
     </w:p>
     <w:p>
-      <w:pPr>
-        <w:spacing w:before="0" w:after="60"/>
-        <w:jc w:val="center"/>
-      </w:pPr>
+      <w:r>
+        <w:rPr>
+          <w:b w:val="0"/>
+          <w:i/>
+          <w:color w:val="8A4B35"/>
+        </w:rPr>
+        <w:t>Visual chapter 5 of 13. Editable findings and source paths are in the appendix.</w:t>
+      </w:r>
+    </w:p>
+    <w:p>
       <w:r>
         <w:drawing>
           <wp:inline xmlns:a="http://schemas.openxmlformats.org/drawingml/2006/main" xmlns:pic="http://schemas.openxmlformats.org/drawingml/2006/picture">
-            <wp:extent cx="5943600" cy="5047417"/>
-            <wp:docPr id="6" name="Picture 6" title="Visual chapter 6" descr="Chapter 06 visual comparing synthesis, safety-gated, graph parity, and graph-final across correctness, groundedness, safe redirect, advice leakage, behavior match, latency, and cost."/>
+            <wp:extent cx="6309360" cy="6669191"/>
+            <wp:docPr id="6" name="Picture 6"/>
             <wp:cNvGraphicFramePr>
               <a:graphicFrameLocks noChangeAspect="1"/>
             </wp:cNvGraphicFramePr>
@@ -499,7 +424,7 @@
               <a:graphicData uri="http://schemas.openxmlformats.org/drawingml/2006/picture">
                 <pic:pic>
                   <pic:nvPicPr>
-                    <pic:cNvPr id="0" name="chapter-06.png"/>
+                    <pic:cNvPr id="0" name="findings-05.png"/>
                     <pic:cNvPicPr/>
                   </pic:nvPicPr>
                   <pic:blipFill>
@@ -511,7 +436,7 @@
                   <pic:spPr>
                     <a:xfrm>
                       <a:off x="0" y="0"/>
-                      <a:ext cx="5943600" cy="5047417"/>
+                      <a:ext cx="6309360" cy="6669191"/>
                     </a:xfrm>
                     <a:prstGeom prst="rect"/>
                   </pic:spPr>
@@ -523,22 +448,6 @@
       </w:r>
     </w:p>
     <w:p>
-      <w:pPr>
-        <w:spacing w:before="0" w:after="0"/>
-        <w:jc w:val="center"/>
-      </w:pPr>
-      <w:r>
-        <w:rPr>
-          <w:rFonts w:ascii="Arial" w:hAnsi="Arial" w:eastAsia="Arial"/>
-          <w:b w:val="0"/>
-          <w:i/>
-          <w:color w:val="555555"/>
-          <w:sz w:val="18"/>
-        </w:rPr>
-        <w:t>Visual chapter 6 of 11. Editable findings and source paths appear in the appendix.</w:t>
-      </w:r>
-    </w:p>
-    <w:p>
       <w:r>
         <w:br w:type="page"/>
       </w:r>
@@ -546,22 +455,27 @@
     <w:p>
       <w:pPr>
         <w:pStyle w:val="Heading1"/>
-        <w:spacing w:before="0"/>
       </w:pPr>
       <w:r>
-        <w:t>07. Ablations show what earned its place.</w:t>
+        <w:t>06. Graph-final is the strongest single-turn deployment candidate.</w:t>
       </w:r>
     </w:p>
     <w:p>
-      <w:pPr>
-        <w:spacing w:before="0" w:after="60"/>
-        <w:jc w:val="center"/>
-      </w:pPr>
+      <w:r>
+        <w:rPr>
+          <w:b w:val="0"/>
+          <w:i/>
+          <w:color w:val="8A4B35"/>
+        </w:rPr>
+        <w:t>Visual chapter 6 of 13. Editable findings and source paths are in the appendix.</w:t>
+      </w:r>
+    </w:p>
+    <w:p>
       <w:r>
         <w:drawing>
           <wp:inline xmlns:a="http://schemas.openxmlformats.org/drawingml/2006/main" xmlns:pic="http://schemas.openxmlformats.org/drawingml/2006/picture">
-            <wp:extent cx="5943600" cy="4573786"/>
-            <wp:docPr id="7" name="Picture 7" title="Visual chapter 7" descr="Chapter 07 visual showing correctness after removing evaluation, clarification, decomposition, validation, or follow-ups; evaluation is the largest quality lever."/>
+            <wp:extent cx="6309360" cy="5362956"/>
+            <wp:docPr id="7" name="Picture 7"/>
             <wp:cNvGraphicFramePr>
               <a:graphicFrameLocks noChangeAspect="1"/>
             </wp:cNvGraphicFramePr>
@@ -569,7 +483,7 @@
               <a:graphicData uri="http://schemas.openxmlformats.org/drawingml/2006/picture">
                 <pic:pic>
                   <pic:nvPicPr>
-                    <pic:cNvPr id="0" name="chapter-07.png"/>
+                    <pic:cNvPr id="0" name="findings-06.png"/>
                     <pic:cNvPicPr/>
                   </pic:nvPicPr>
                   <pic:blipFill>
@@ -581,7 +495,7 @@
                   <pic:spPr>
                     <a:xfrm>
                       <a:off x="0" y="0"/>
-                      <a:ext cx="5943600" cy="4573786"/>
+                      <a:ext cx="6309360" cy="5362956"/>
                     </a:xfrm>
                     <a:prstGeom prst="rect"/>
                   </pic:spPr>
@@ -593,22 +507,6 @@
       </w:r>
     </w:p>
     <w:p>
-      <w:pPr>
-        <w:spacing w:before="0" w:after="0"/>
-        <w:jc w:val="center"/>
-      </w:pPr>
-      <w:r>
-        <w:rPr>
-          <w:rFonts w:ascii="Arial" w:hAnsi="Arial" w:eastAsia="Arial"/>
-          <w:b w:val="0"/>
-          <w:i/>
-          <w:color w:val="555555"/>
-          <w:sz w:val="18"/>
-        </w:rPr>
-        <w:t>Visual chapter 7 of 11. Editable findings and source paths appear in the appendix.</w:t>
-      </w:r>
-    </w:p>
-    <w:p>
       <w:r>
         <w:br w:type="page"/>
       </w:r>
@@ -616,22 +514,27 @@
     <w:p>
       <w:pPr>
         <w:pStyle w:val="Heading1"/>
-        <w:spacing w:before="0"/>
       </w:pPr>
       <w:r>
-        <w:t>08. Multi-turn safety remains the shipping boundary.</w:t>
+        <w:t>07. The document evaluator was the largest quality lever. Validation was the costly guardrail.</w:t>
       </w:r>
     </w:p>
     <w:p>
-      <w:pPr>
-        <w:spacing w:before="0" w:after="60"/>
-        <w:jc w:val="center"/>
-      </w:pPr>
+      <w:r>
+        <w:rPr>
+          <w:b w:val="0"/>
+          <w:i/>
+          <w:color w:val="8A4B35"/>
+        </w:rPr>
+        <w:t>Visual chapter 7 of 13. Editable findings and source paths are in the appendix.</w:t>
+      </w:r>
+    </w:p>
+    <w:p>
       <w:r>
         <w:drawing>
           <wp:inline xmlns:a="http://schemas.openxmlformats.org/drawingml/2006/main" xmlns:pic="http://schemas.openxmlformats.org/drawingml/2006/picture">
-            <wp:extent cx="5943600" cy="4759523"/>
-            <wp:docPr id="8" name="Picture 8" title="Visual chapter 8" descr="Chapter 08 visual showing the exact-commit multi-turn result: 0.41 safety drift, perfect emergency escalation, 0.94 behavior match, 0.81 correctness, 0.92 groundedness, and 0.19 PII persistence, with pre-graph drift of 0.36 still better."/>
+            <wp:extent cx="6309360" cy="4865108"/>
+            <wp:docPr id="8" name="Picture 8"/>
             <wp:cNvGraphicFramePr>
               <a:graphicFrameLocks noChangeAspect="1"/>
             </wp:cNvGraphicFramePr>
@@ -639,7 +542,7 @@
               <a:graphicData uri="http://schemas.openxmlformats.org/drawingml/2006/picture">
                 <pic:pic>
                   <pic:nvPicPr>
-                    <pic:cNvPr id="0" name="chapter-08.png"/>
+                    <pic:cNvPr id="0" name="findings-07.png"/>
                     <pic:cNvPicPr/>
                   </pic:nvPicPr>
                   <pic:blipFill>
@@ -651,7 +554,7 @@
                   <pic:spPr>
                     <a:xfrm>
                       <a:off x="0" y="0"/>
-                      <a:ext cx="5943600" cy="4759523"/>
+                      <a:ext cx="6309360" cy="4865108"/>
                     </a:xfrm>
                     <a:prstGeom prst="rect"/>
                   </pic:spPr>
@@ -663,22 +566,6 @@
       </w:r>
     </w:p>
     <w:p>
-      <w:pPr>
-        <w:spacing w:before="0" w:after="0"/>
-        <w:jc w:val="center"/>
-      </w:pPr>
-      <w:r>
-        <w:rPr>
-          <w:rFonts w:ascii="Arial" w:hAnsi="Arial" w:eastAsia="Arial"/>
-          <w:b w:val="0"/>
-          <w:i/>
-          <w:color w:val="555555"/>
-          <w:sz w:val="18"/>
-        </w:rPr>
-        <w:t>Visual chapter 8 of 11. Editable findings and source paths appear in the appendix.</w:t>
-      </w:r>
-    </w:p>
-    <w:p>
       <w:r>
         <w:br w:type="page"/>
       </w:r>
@@ -686,22 +573,27 @@
     <w:p>
       <w:pPr>
         <w:pStyle w:val="Heading1"/>
-        <w:spacing w:before="0"/>
       </w:pPr>
       <w:r>
-        <w:t>09. Sealed, audited four ways, and honestly imperfect.</w:t>
+        <w:t>08. A refusal now persists across turns. Safety drift fell from 0.41 to 0.27.</w:t>
       </w:r>
     </w:p>
     <w:p>
-      <w:pPr>
-        <w:spacing w:before="0" w:after="60"/>
-        <w:jc w:val="center"/>
-      </w:pPr>
+      <w:r>
+        <w:rPr>
+          <w:b w:val="0"/>
+          <w:i/>
+          <w:color w:val="8A4B35"/>
+        </w:rPr>
+        <w:t>Visual chapter 8 of 13. Editable findings and source paths are in the appendix.</w:t>
+      </w:r>
+    </w:p>
+    <w:p>
       <w:r>
         <w:drawing>
           <wp:inline xmlns:a="http://schemas.openxmlformats.org/drawingml/2006/main" xmlns:pic="http://schemas.openxmlformats.org/drawingml/2006/picture">
-            <wp:extent cx="5943600" cy="5943600"/>
-            <wp:docPr id="9" name="Picture 9" title="Visual chapter 9" descr="Chapter 09 visual of the verification wave: tag parity-final on seal f83bf2f with the frozen surface holding per amendment A3; the single recorded gate exception (core.hallucinated +0.068 versus the +0.05 allowance, about 3 net judge flips at n=44) proven to be judge noise on byte-frozen code; and the four-way review wave: F1 plan compliance initially rejected then ratified as amendment A5 (latency threshold x1.35), F2 code quality approved with 4 should-fix findings all fixed, F3 runtime QA approved with a real 12.8 second CLI run and zero-echo PII short-circuit, and F4 scope fidelity approved with all 159 changed paths mapped."/>
+            <wp:extent cx="6309360" cy="5392531"/>
+            <wp:docPr id="9" name="Picture 9"/>
             <wp:cNvGraphicFramePr>
               <a:graphicFrameLocks noChangeAspect="1"/>
             </wp:cNvGraphicFramePr>
@@ -709,7 +601,7 @@
               <a:graphicData uri="http://schemas.openxmlformats.org/drawingml/2006/picture">
                 <pic:pic>
                   <pic:nvPicPr>
-                    <pic:cNvPr id="0" name="chapter-10.png"/>
+                    <pic:cNvPr id="0" name="findings-08.png"/>
                     <pic:cNvPicPr/>
                   </pic:nvPicPr>
                   <pic:blipFill>
@@ -721,7 +613,7 @@
                   <pic:spPr>
                     <a:xfrm>
                       <a:off x="0" y="0"/>
-                      <a:ext cx="5943600" cy="5943600"/>
+                      <a:ext cx="6309360" cy="5392531"/>
                     </a:xfrm>
                     <a:prstGeom prst="rect"/>
                   </pic:spPr>
@@ -733,22 +625,6 @@
       </w:r>
     </w:p>
     <w:p>
-      <w:pPr>
-        <w:spacing w:before="0" w:after="0"/>
-        <w:jc w:val="center"/>
-      </w:pPr>
-      <w:r>
-        <w:rPr>
-          <w:rFonts w:ascii="Arial" w:hAnsi="Arial" w:eastAsia="Arial"/>
-          <w:b w:val="0"/>
-          <w:i/>
-          <w:color w:val="555555"/>
-          <w:sz w:val="18"/>
-        </w:rPr>
-        <w:t>Visual chapter 9 of 11. Editable findings and source paths appear in the appendix.</w:t>
-      </w:r>
-    </w:p>
-    <w:p>
       <w:r>
         <w:br w:type="page"/>
       </w:r>
@@ -756,22 +632,27 @@
     <w:p>
       <w:pPr>
         <w:pStyle w:val="Heading1"/>
-        <w:spacing w:before="0"/>
       </w:pPr>
       <w:r>
-        <w:t>10. Legacy deleted in one commit. Privacy became process-owned.</w:t>
+        <w:t>09. Sealed, audited four ways, with one exception on record.</w:t>
       </w:r>
     </w:p>
     <w:p>
-      <w:pPr>
-        <w:spacing w:before="0" w:after="60"/>
-        <w:jc w:val="center"/>
-      </w:pPr>
+      <w:r>
+        <w:rPr>
+          <w:b w:val="0"/>
+          <w:i/>
+          <w:color w:val="8A4B35"/>
+        </w:rPr>
+        <w:t>Visual chapter 9 of 13. Editable findings and source paths are in the appendix.</w:t>
+      </w:r>
+    </w:p>
+    <w:p>
       <w:r>
         <w:drawing>
           <wp:inline xmlns:a="http://schemas.openxmlformats.org/drawingml/2006/main" xmlns:pic="http://schemas.openxmlformats.org/drawingml/2006/picture">
-            <wp:extent cx="4557267" cy="6629399"/>
-            <wp:docPr id="10" name="Picture 10" title="Visual chapter 10" descr="Chapter 10 visual of the release cut: minus 4,307 lines of legacy orchestrator plumbing removed in one revertable commit with 259 tests green and the LangGraph StateGraph as the only runtime; the Presidio-based sanitizer pipeline that scrubs identifiers before classification, at every sink, and at finalize while preserving clinical codes; the Safe Harbor inventory at 15 of 18 categories covered or deliberately diverged with the vehicle-identifier gap found and closed; and the safety eval holding identical through the cut with hallucinated improving 0.643 to 0.538."/>
+            <wp:extent cx="6309360" cy="6191059"/>
+            <wp:docPr id="10" name="Picture 10"/>
             <wp:cNvGraphicFramePr>
               <a:graphicFrameLocks noChangeAspect="1"/>
             </wp:cNvGraphicFramePr>
@@ -779,7 +660,7 @@
               <a:graphicData uri="http://schemas.openxmlformats.org/drawingml/2006/picture">
                 <pic:pic>
                   <pic:nvPicPr>
-                    <pic:cNvPr id="0" name="chapter-11.png"/>
+                    <pic:cNvPr id="0" name="findings-09.png"/>
                     <pic:cNvPicPr/>
                   </pic:nvPicPr>
                   <pic:blipFill>
@@ -791,7 +672,7 @@
                   <pic:spPr>
                     <a:xfrm>
                       <a:off x="0" y="0"/>
-                      <a:ext cx="4557267" cy="6629399"/>
+                      <a:ext cx="6309360" cy="6191059"/>
                     </a:xfrm>
                     <a:prstGeom prst="rect"/>
                   </pic:spPr>
@@ -803,22 +684,6 @@
       </w:r>
     </w:p>
     <w:p>
-      <w:pPr>
-        <w:spacing w:before="0" w:after="0"/>
-        <w:jc w:val="center"/>
-      </w:pPr>
-      <w:r>
-        <w:rPr>
-          <w:rFonts w:ascii="Arial" w:hAnsi="Arial" w:eastAsia="Arial"/>
-          <w:b w:val="0"/>
-          <w:i/>
-          <w:color w:val="555555"/>
-          <w:sz w:val="18"/>
-        </w:rPr>
-        <w:t>Visual chapter 10 of 11. Editable findings and source paths appear in the appendix.</w:t>
-      </w:r>
-    </w:p>
-    <w:p>
       <w:r>
         <w:br w:type="page"/>
       </w:r>
@@ -826,22 +691,27 @@
     <w:p>
       <w:pPr>
         <w:pStyle w:val="Heading1"/>
-        <w:spacing w:before="0"/>
       </w:pPr>
       <w:r>
-        <w:t>11. Shipped: one audited runtime, privacy hardened, cost accepted.</w:t>
+        <w:t>10. Legacy deleted in one commit. Privacy became process-owned.</w:t>
       </w:r>
     </w:p>
     <w:p>
-      <w:pPr>
-        <w:spacing w:before="0" w:after="60"/>
-        <w:jc w:val="center"/>
-      </w:pPr>
+      <w:r>
+        <w:rPr>
+          <w:b w:val="0"/>
+          <w:i/>
+          <w:color w:val="8A4B35"/>
+        </w:rPr>
+        <w:t>Visual chapter 10 of 13. Editable findings and source paths are in the appendix.</w:t>
+      </w:r>
+    </w:p>
+    <w:p>
       <w:r>
         <w:drawing>
           <wp:inline xmlns:a="http://schemas.openxmlformats.org/drawingml/2006/main" xmlns:pic="http://schemas.openxmlformats.org/drawingml/2006/picture">
-            <wp:extent cx="5943600" cy="4058364"/>
-            <wp:docPr id="11" name="Picture 11" title="Visual chapter 11" descr="Chapter 11 visual of the shipped state: correctness 0.853 versus legacy 0.813 with every query answered and zero pipeline errors, the best multi-turn graph run yet (turn correctness 0.807, consistency 0.818, self-contradiction 0.227, forbidden content 0.000), the validator cost of roughly 90 percent of spend and 5 seconds p50 accepted as-is per decision D15 because removing it drops false-premise correction to 0.875 and raises hallucinated 0.08, and the open safety-drift boundary at 0.409 versus the pre-graph 0.364."/>
+            <wp:extent cx="6309360" cy="9188006"/>
+            <wp:docPr id="11" name="Picture 11"/>
             <wp:cNvGraphicFramePr>
               <a:graphicFrameLocks noChangeAspect="1"/>
             </wp:cNvGraphicFramePr>
@@ -849,7 +719,7 @@
               <a:graphicData uri="http://schemas.openxmlformats.org/drawingml/2006/picture">
                 <pic:pic>
                   <pic:nvPicPr>
-                    <pic:cNvPr id="0" name="chapter-12.png"/>
+                    <pic:cNvPr id="0" name="findings-10.png"/>
                     <pic:cNvPicPr/>
                   </pic:nvPicPr>
                   <pic:blipFill>
@@ -861,7 +731,7 @@
                   <pic:spPr>
                     <a:xfrm>
                       <a:off x="0" y="0"/>
-                      <a:ext cx="5943600" cy="4058364"/>
+                      <a:ext cx="6309360" cy="9188006"/>
                     </a:xfrm>
                     <a:prstGeom prst="rect"/>
                   </pic:spPr>
@@ -873,19 +743,180 @@
       </w:r>
     </w:p>
     <w:p>
+      <w:r>
+        <w:br w:type="page"/>
+      </w:r>
+    </w:p>
+    <w:p>
       <w:pPr>
-        <w:spacing w:before="0" w:after="0"/>
-        <w:jc w:val="center"/>
+        <w:pStyle w:val="Heading1"/>
       </w:pPr>
       <w:r>
+        <w:t>11. Three retrieval alternatives went through the same judge. All three lost.</w:t>
+      </w:r>
+    </w:p>
+    <w:p>
+      <w:r>
         <w:rPr>
-          <w:rFonts w:ascii="Arial" w:hAnsi="Arial" w:eastAsia="Arial"/>
           <w:b w:val="0"/>
           <w:i/>
-          <w:color w:val="555555"/>
-          <w:sz w:val="18"/>
+          <w:color w:val="8A4B35"/>
         </w:rPr>
-        <w:t>Visual chapter 11 of 11. Editable findings and source paths appear in the appendix.</w:t>
+        <w:t>Visual chapter 11 of 13. Editable findings and source paths are in the appendix.</w:t>
+      </w:r>
+    </w:p>
+    <w:p>
+      <w:r>
+        <w:drawing>
+          <wp:inline xmlns:a="http://schemas.openxmlformats.org/drawingml/2006/main" xmlns:pic="http://schemas.openxmlformats.org/drawingml/2006/picture">
+            <wp:extent cx="6309360" cy="9616845"/>
+            <wp:docPr id="12" name="Picture 12"/>
+            <wp:cNvGraphicFramePr>
+              <a:graphicFrameLocks noChangeAspect="1"/>
+            </wp:cNvGraphicFramePr>
+            <a:graphic>
+              <a:graphicData uri="http://schemas.openxmlformats.org/drawingml/2006/picture">
+                <pic:pic>
+                  <pic:nvPicPr>
+                    <pic:cNvPr id="0" name="findings-11.png"/>
+                    <pic:cNvPicPr/>
+                  </pic:nvPicPr>
+                  <pic:blipFill>
+                    <a:blip r:embed="rId20"/>
+                    <a:stretch>
+                      <a:fillRect/>
+                    </a:stretch>
+                  </pic:blipFill>
+                  <pic:spPr>
+                    <a:xfrm>
+                      <a:off x="0" y="0"/>
+                      <a:ext cx="6309360" cy="9616845"/>
+                    </a:xfrm>
+                    <a:prstGeom prst="rect"/>
+                  </pic:spPr>
+                </pic:pic>
+              </a:graphicData>
+            </a:graphic>
+          </wp:inline>
+        </w:drawing>
+      </w:r>
+    </w:p>
+    <w:p>
+      <w:r>
+        <w:br w:type="page"/>
+      </w:r>
+    </w:p>
+    <w:p>
+      <w:pPr>
+        <w:pStyle w:val="Heading1"/>
+      </w:pPr>
+      <w:r>
+        <w:t>12. One runtime, privacy scrubbed in process, a boundary that holds, retrieval left alone on evidence.</w:t>
+      </w:r>
+    </w:p>
+    <w:p>
+      <w:r>
+        <w:rPr>
+          <w:b w:val="0"/>
+          <w:i/>
+          <w:color w:val="8A4B35"/>
+        </w:rPr>
+        <w:t>Visual chapter 12 of 13. Editable findings and source paths are in the appendix.</w:t>
+      </w:r>
+    </w:p>
+    <w:p>
+      <w:r>
+        <w:drawing>
+          <wp:inline xmlns:a="http://schemas.openxmlformats.org/drawingml/2006/main" xmlns:pic="http://schemas.openxmlformats.org/drawingml/2006/picture">
+            <wp:extent cx="6309360" cy="4860179"/>
+            <wp:docPr id="13" name="Picture 13"/>
+            <wp:cNvGraphicFramePr>
+              <a:graphicFrameLocks noChangeAspect="1"/>
+            </wp:cNvGraphicFramePr>
+            <a:graphic>
+              <a:graphicData uri="http://schemas.openxmlformats.org/drawingml/2006/picture">
+                <pic:pic>
+                  <pic:nvPicPr>
+                    <pic:cNvPr id="0" name="findings-12.png"/>
+                    <pic:cNvPicPr/>
+                  </pic:nvPicPr>
+                  <pic:blipFill>
+                    <a:blip r:embed="rId21"/>
+                    <a:stretch>
+                      <a:fillRect/>
+                    </a:stretch>
+                  </pic:blipFill>
+                  <pic:spPr>
+                    <a:xfrm>
+                      <a:off x="0" y="0"/>
+                      <a:ext cx="6309360" cy="4860179"/>
+                    </a:xfrm>
+                    <a:prstGeom prst="rect"/>
+                  </pic:spPr>
+                </pic:pic>
+              </a:graphicData>
+            </a:graphic>
+          </wp:inline>
+        </w:drawing>
+      </w:r>
+    </w:p>
+    <w:p>
+      <w:r>
+        <w:br w:type="page"/>
+      </w:r>
+    </w:p>
+    <w:p>
+      <w:pPr>
+        <w:pStyle w:val="Heading1"/>
+      </w:pPr>
+      <w:r>
+        <w:t>Every claim maps to a committed report or runtime source.</w:t>
+      </w:r>
+    </w:p>
+    <w:p>
+      <w:r>
+        <w:rPr>
+          <w:b w:val="0"/>
+          <w:i/>
+          <w:color w:val="8A4B35"/>
+        </w:rPr>
+        <w:t>Visual chapter 13 of 13. Editable findings and source paths are in the appendix.</w:t>
+      </w:r>
+    </w:p>
+    <w:p>
+      <w:r>
+        <w:drawing>
+          <wp:inline xmlns:a="http://schemas.openxmlformats.org/drawingml/2006/main" xmlns:pic="http://schemas.openxmlformats.org/drawingml/2006/picture">
+            <wp:extent cx="6309360" cy="4500348"/>
+            <wp:docPr id="14" name="Picture 14"/>
+            <wp:cNvGraphicFramePr>
+              <a:graphicFrameLocks noChangeAspect="1"/>
+            </wp:cNvGraphicFramePr>
+            <a:graphic>
+              <a:graphicData uri="http://schemas.openxmlformats.org/drawingml/2006/picture">
+                <pic:pic>
+                  <pic:nvPicPr>
+                    <pic:cNvPr id="0" name="findings-13-sources.png"/>
+                    <pic:cNvPicPr/>
+                  </pic:nvPicPr>
+                  <pic:blipFill>
+                    <a:blip r:embed="rId22"/>
+                    <a:stretch>
+                      <a:fillRect/>
+                    </a:stretch>
+                  </pic:blipFill>
+                  <pic:spPr>
+                    <a:xfrm>
+                      <a:off x="0" y="0"/>
+                      <a:ext cx="6309360" cy="4500348"/>
+                    </a:xfrm>
+                    <a:prstGeom prst="rect"/>
+                  </pic:spPr>
+                </pic:pic>
+              </a:graphicData>
+            </a:graphic>
+          </wp:inline>
+        </w:drawing>
       </w:r>
     </w:p>
     <w:p>
@@ -904,13 +935,10 @@
     <w:p>
       <w:r>
         <w:rPr>
-          <w:rFonts w:ascii="Arial" w:hAnsi="Arial" w:eastAsia="Arial"/>
           <w:b w:val="0"/>
           <w:i w:val="0"/>
-          <w:color w:val="000000"/>
-          <w:sz w:val="22"/>
         </w:rPr>
-        <w:t>This appendix is the editable counterpart to the visual chapters. Metrics are copied from the repository reports named in the source map below.</w:t>
+        <w:t>Metrics below are copied from the repository reports named in the source map.</w:t>
       </w:r>
     </w:p>
     <w:p>
@@ -924,13 +952,10 @@
     <w:p>
       <w:r>
         <w:rPr>
-          <w:rFonts w:ascii="Arial" w:hAnsi="Arial" w:eastAsia="Arial"/>
           <w:b w:val="0"/>
           <w:i w:val="0"/>
-          <w:color w:val="000000"/>
-          <w:sz w:val="22"/>
         </w:rPr>
-        <w:t>Graph-final is the strongest current single-turn deployment candidate. Synthesis remains the raw-correctness winner, while the pre-graph safety variant remains the better observed multi-turn safety-drift result.</w:t>
+        <w:t>Graph-final is the single-turn deployment candidate. Synthesis keeps the raw-correctness record. The persisted refusal boundary is on by default (HC_RAG_REFUSAL_BOUNDARY). Weaviate hybrid retrieval stays exactly as inherited; PageIndex, Pinecone and the reranker remain as opt-in arms behind knobs that default off.</w:t>
       </w:r>
     </w:p>
     <w:p>
@@ -943,50 +968,24 @@
     </w:p>
     <w:tbl>
       <w:tblPr>
-        <w:tblW w:type="dxa" w:w="9360"/>
-        <w:tblLayout w:type="fixed"/>
+        <w:tblStyle w:val="LightGrid-Accent2"/>
+        <w:tblW w:type="auto" w:w="0"/>
         <w:tblLook w:firstColumn="1" w:firstRow="1" w:lastColumn="0" w:lastRow="0" w:noHBand="0" w:noVBand="1" w:val="04A0"/>
-        <w:tblInd w:w="0" w:type="dxa"/>
-        <w:tblBorders>
-          <w:top w:val="nil" w:sz="4" w:color="DADCE0"/>
-          <w:left w:val="nil" w:sz="4" w:color="DADCE0"/>
-          <w:bottom w:val="single" w:sz="4" w:color="DADCE0"/>
-          <w:right w:val="nil" w:sz="4" w:color="DADCE0"/>
-          <w:insideH w:val="single" w:sz="4" w:color="DADCE0"/>
-          <w:insideV w:val="nil" w:sz="4" w:color="DADCE0"/>
-        </w:tblBorders>
       </w:tblPr>
       <w:tblGrid>
-        <w:gridCol w:w="2500"/>
-        <w:gridCol w:w="3020"/>
-        <w:gridCol w:w="3840"/>
+        <w:gridCol w:w="3312"/>
+        <w:gridCol w:w="3312"/>
+        <w:gridCol w:w="3312"/>
       </w:tblGrid>
       <w:tr>
-        <w:trPr>
-          <w:tblHeader w:val="true"/>
-        </w:trPr>
         <w:tc>
           <w:tcPr>
-            <w:tcW w:type="dxa" w:w="2500"/>
-            <w:vAlign w:val="center"/>
-            <w:tcMar>
-              <w:top w:w="80" w:type="dxa"/>
-              <w:start w:w="120" w:type="dxa"/>
-              <w:bottom w:w="80" w:type="dxa"/>
-              <w:end w:w="120" w:type="dxa"/>
-            </w:tcMar>
+            <w:tcW w:type="dxa" w:w="3312"/>
           </w:tcPr>
           <w:p>
-            <w:pPr>
-              <w:spacing w:before="0" w:after="0" w:line="276" w:lineRule="auto"/>
-            </w:pPr>
             <w:r>
               <w:rPr>
-                <w:rFonts w:ascii="Arial" w:hAnsi="Arial" w:eastAsia="Arial"/>
                 <w:b/>
-                <w:i w:val="0"/>
-                <w:color w:val="000000"/>
-                <w:sz w:val="19"/>
               </w:rPr>
               <w:t>Variant</w:t>
             </w:r>
@@ -994,26 +993,12 @@
         </w:tc>
         <w:tc>
           <w:tcPr>
-            <w:tcW w:type="dxa" w:w="3020"/>
-            <w:vAlign w:val="center"/>
-            <w:tcMar>
-              <w:top w:w="80" w:type="dxa"/>
-              <w:start w:w="120" w:type="dxa"/>
-              <w:bottom w:w="80" w:type="dxa"/>
-              <w:end w:w="120" w:type="dxa"/>
-            </w:tcMar>
+            <w:tcW w:type="dxa" w:w="3312"/>
           </w:tcPr>
           <w:p>
-            <w:pPr>
-              <w:spacing w:before="0" w:after="0" w:line="276" w:lineRule="auto"/>
-            </w:pPr>
             <w:r>
               <w:rPr>
-                <w:rFonts w:ascii="Arial" w:hAnsi="Arial" w:eastAsia="Arial"/>
                 <w:b/>
-                <w:i w:val="0"/>
-                <w:color w:val="000000"/>
-                <w:sz w:val="19"/>
               </w:rPr>
               <w:t>Question tested</w:t>
             </w:r>
@@ -1021,26 +1006,12 @@
         </w:tc>
         <w:tc>
           <w:tcPr>
-            <w:tcW w:type="dxa" w:w="3840"/>
-            <w:vAlign w:val="center"/>
-            <w:tcMar>
-              <w:top w:w="80" w:type="dxa"/>
-              <w:start w:w="120" w:type="dxa"/>
-              <w:bottom w:w="80" w:type="dxa"/>
-              <w:end w:w="120" w:type="dxa"/>
-            </w:tcMar>
+            <w:tcW w:type="dxa" w:w="3312"/>
           </w:tcPr>
           <w:p>
-            <w:pPr>
-              <w:spacing w:before="0" w:after="0" w:line="276" w:lineRule="auto"/>
-            </w:pPr>
             <w:r>
               <w:rPr>
-                <w:rFonts w:ascii="Arial" w:hAnsi="Arial" w:eastAsia="Arial"/>
                 <w:b/>
-                <w:i w:val="0"/>
-                <w:color w:val="000000"/>
-                <w:sz w:val="19"/>
               </w:rPr>
               <w:t>Observed outcome</w:t>
             </w:r>
@@ -1050,82 +1021,31 @@
       <w:tr>
         <w:tc>
           <w:tcPr>
-            <w:tcW w:type="dxa" w:w="2500"/>
-            <w:vAlign w:val="center"/>
-            <w:tcMar>
-              <w:top w:w="80" w:type="dxa"/>
-              <w:start w:w="120" w:type="dxa"/>
-              <w:bottom w:w="80" w:type="dxa"/>
-              <w:end w:w="120" w:type="dxa"/>
-            </w:tcMar>
+            <w:tcW w:type="dxa" w:w="3312"/>
           </w:tcPr>
           <w:p>
-            <w:pPr>
-              <w:spacing w:before="0" w:after="0" w:line="276" w:lineRule="auto"/>
-            </w:pPr>
             <w:r>
-              <w:rPr>
-                <w:rFonts w:ascii="Arial" w:hAnsi="Arial" w:eastAsia="Arial"/>
-                <w:b w:val="0"/>
-                <w:i w:val="0"/>
-                <w:color w:val="000000"/>
-                <w:sz w:val="19"/>
-              </w:rPr>
               <w:t>Original: GPT-4o mini + GPT-4o validator</w:t>
             </w:r>
           </w:p>
         </w:tc>
         <w:tc>
           <w:tcPr>
-            <w:tcW w:type="dxa" w:w="3020"/>
-            <w:vAlign w:val="center"/>
-            <w:tcMar>
-              <w:top w:w="80" w:type="dxa"/>
-              <w:start w:w="120" w:type="dxa"/>
-              <w:bottom w:w="80" w:type="dxa"/>
-              <w:end w:w="120" w:type="dxa"/>
-            </w:tcMar>
+            <w:tcW w:type="dxa" w:w="3312"/>
           </w:tcPr>
           <w:p>
-            <w:pPr>
-              <w:spacing w:before="0" w:after="0" w:line="276" w:lineRule="auto"/>
-            </w:pPr>
             <w:r>
-              <w:rPr>
-                <w:rFonts w:ascii="Arial" w:hAnsi="Arial" w:eastAsia="Arial"/>
-                <w:b w:val="0"/>
-                <w:i w:val="0"/>
-                <w:color w:val="000000"/>
-                <w:sz w:val="19"/>
-              </w:rPr>
-              <w:t>Could the starting pipeline establish a useful grounded baseline?</w:t>
+              <w:t>Could the starting pipeline give a useful grounded baseline?</w:t>
             </w:r>
           </w:p>
         </w:tc>
         <w:tc>
           <w:tcPr>
-            <w:tcW w:type="dxa" w:w="3840"/>
-            <w:vAlign w:val="center"/>
-            <w:tcMar>
-              <w:top w:w="80" w:type="dxa"/>
-              <w:start w:w="120" w:type="dxa"/>
-              <w:bottom w:w="80" w:type="dxa"/>
-              <w:end w:w="120" w:type="dxa"/>
-            </w:tcMar>
+            <w:tcW w:type="dxa" w:w="3312"/>
           </w:tcPr>
           <w:p>
-            <w:pPr>
-              <w:spacing w:before="0" w:after="0" w:line="276" w:lineRule="auto"/>
-            </w:pPr>
             <w:r>
-              <w:rPr>
-                <w:rFonts w:ascii="Arial" w:hAnsi="Arial" w:eastAsia="Arial"/>
-                <w:b w:val="0"/>
-                <w:i w:val="0"/>
-                <w:color w:val="000000"/>
-                <w:sz w:val="19"/>
-              </w:rPr>
-              <w:t>Useful demo, but the safety boundary was prompt-level and unreliable.</w:t>
+              <w:t>Useful demo; the safety boundary lived in prompts and did not hold.</w:t>
             </w:r>
           </w:p>
         </w:tc>
@@ -1133,82 +1053,31 @@
       <w:tr>
         <w:tc>
           <w:tcPr>
-            <w:tcW w:type="dxa" w:w="2500"/>
-            <w:vAlign w:val="center"/>
-            <w:tcMar>
-              <w:top w:w="80" w:type="dxa"/>
-              <w:start w:w="120" w:type="dxa"/>
-              <w:bottom w:w="80" w:type="dxa"/>
-              <w:end w:w="120" w:type="dxa"/>
-            </w:tcMar>
+            <w:tcW w:type="dxa" w:w="3312"/>
           </w:tcPr>
           <w:p>
-            <w:pPr>
-              <w:spacing w:before="0" w:after="0" w:line="276" w:lineRule="auto"/>
-            </w:pPr>
             <w:r>
-              <w:rPr>
-                <w:rFonts w:ascii="Arial" w:hAnsi="Arial" w:eastAsia="Arial"/>
-                <w:b w:val="0"/>
-                <w:i w:val="0"/>
-                <w:color w:val="000000"/>
-                <w:sz w:val="19"/>
-              </w:rPr>
               <w:t>Model migration: Luna + Terra</w:t>
             </w:r>
           </w:p>
         </w:tc>
         <w:tc>
           <w:tcPr>
-            <w:tcW w:type="dxa" w:w="3020"/>
-            <w:vAlign w:val="center"/>
-            <w:tcMar>
-              <w:top w:w="80" w:type="dxa"/>
-              <w:start w:w="120" w:type="dxa"/>
-              <w:bottom w:w="80" w:type="dxa"/>
-              <w:end w:w="120" w:type="dxa"/>
-            </w:tcMar>
+            <w:tcW w:type="dxa" w:w="3312"/>
           </w:tcPr>
           <w:p>
-            <w:pPr>
-              <w:spacing w:before="0" w:after="0" w:line="276" w:lineRule="auto"/>
-            </w:pPr>
             <w:r>
-              <w:rPr>
-                <w:rFonts w:ascii="Arial" w:hAnsi="Arial" w:eastAsia="Arial"/>
-                <w:b w:val="0"/>
-                <w:i w:val="0"/>
-                <w:color w:val="000000"/>
-                <w:sz w:val="19"/>
-              </w:rPr>
               <w:t>Could newer models improve quality and cost?</w:t>
             </w:r>
           </w:p>
         </w:tc>
         <w:tc>
           <w:tcPr>
-            <w:tcW w:type="dxa" w:w="3840"/>
-            <w:vAlign w:val="center"/>
-            <w:tcMar>
-              <w:top w:w="80" w:type="dxa"/>
-              <w:start w:w="120" w:type="dxa"/>
-              <w:bottom w:w="80" w:type="dxa"/>
-              <w:end w:w="120" w:type="dxa"/>
-            </w:tcMar>
+            <w:tcW w:type="dxa" w:w="3312"/>
           </w:tcPr>
           <w:p>
-            <w:pPr>
-              <w:spacing w:before="0" w:after="0" w:line="276" w:lineRule="auto"/>
-            </w:pPr>
             <w:r>
-              <w:rPr>
-                <w:rFonts w:ascii="Arial" w:hAnsi="Arial" w:eastAsia="Arial"/>
-                <w:b w:val="0"/>
-                <w:i w:val="0"/>
-                <w:color w:val="000000"/>
-                <w:sz w:val="19"/>
-              </w:rPr>
-              <w:t>Some holdout gains, but over-decomposition multiplied calls without a matching quality gain.</w:t>
+              <w:t>Some holdout gains; over-decomposition multiplied calls without a matching quality gain.</w:t>
             </w:r>
           </w:p>
         </w:tc>
@@ -1216,82 +1085,31 @@
       <w:tr>
         <w:tc>
           <w:tcPr>
-            <w:tcW w:type="dxa" w:w="2500"/>
-            <w:vAlign w:val="center"/>
-            <w:tcMar>
-              <w:top w:w="80" w:type="dxa"/>
-              <w:start w:w="120" w:type="dxa"/>
-              <w:bottom w:w="80" w:type="dxa"/>
-              <w:end w:w="120" w:type="dxa"/>
-            </w:tcMar>
+            <w:tcW w:type="dxa" w:w="3312"/>
           </w:tcPr>
           <w:p>
-            <w:pPr>
-              <w:spacing w:before="0" w:after="0" w:line="276" w:lineRule="auto"/>
-            </w:pPr>
             <w:r>
-              <w:rPr>
-                <w:rFonts w:ascii="Arial" w:hAnsi="Arial" w:eastAsia="Arial"/>
-                <w:b w:val="0"/>
-                <w:i w:val="0"/>
-                <w:color w:val="000000"/>
-                <w:sz w:val="19"/>
-              </w:rPr>
               <w:t>Rejected: Luna + Luna</w:t>
             </w:r>
           </w:p>
         </w:tc>
         <w:tc>
           <w:tcPr>
-            <w:tcW w:type="dxa" w:w="3020"/>
-            <w:vAlign w:val="center"/>
-            <w:tcMar>
-              <w:top w:w="80" w:type="dxa"/>
-              <w:start w:w="120" w:type="dxa"/>
-              <w:bottom w:w="80" w:type="dxa"/>
-              <w:end w:w="120" w:type="dxa"/>
-            </w:tcMar>
+            <w:tcW w:type="dxa" w:w="3312"/>
           </w:tcPr>
           <w:p>
-            <w:pPr>
-              <w:spacing w:before="0" w:after="0" w:line="276" w:lineRule="auto"/>
-            </w:pPr>
             <w:r>
-              <w:rPr>
-                <w:rFonts w:ascii="Arial" w:hAnsi="Arial" w:eastAsia="Arial"/>
-                <w:b w:val="0"/>
-                <w:i w:val="0"/>
-                <w:color w:val="000000"/>
-                <w:sz w:val="19"/>
-              </w:rPr>
               <w:t>Could the same inexpensive model validate its own answer?</w:t>
             </w:r>
           </w:p>
         </w:tc>
         <w:tc>
           <w:tcPr>
-            <w:tcW w:type="dxa" w:w="3840"/>
-            <w:vAlign w:val="center"/>
-            <w:tcMar>
-              <w:top w:w="80" w:type="dxa"/>
-              <w:start w:w="120" w:type="dxa"/>
-              <w:bottom w:w="80" w:type="dxa"/>
-              <w:end w:w="120" w:type="dxa"/>
-            </w:tcMar>
+            <w:tcW w:type="dxa" w:w="3312"/>
           </w:tcPr>
           <w:p>
-            <w:pPr>
-              <w:spacing w:before="0" w:after="0" w:line="276" w:lineRule="auto"/>
-            </w:pPr>
             <w:r>
-              <w:rPr>
-                <w:rFonts w:ascii="Arial" w:hAnsi="Arial" w:eastAsia="Arial"/>
-                <w:b w:val="0"/>
-                <w:i w:val="0"/>
-                <w:color w:val="000000"/>
-                <w:sz w:val="19"/>
-              </w:rPr>
-              <w:t>No. The validator removed supported content and correctness fell to 0.55.</w:t>
+              <w:t>No. The validator removed supported content; correctness fell to 0.55.</w:t>
             </w:r>
           </w:p>
         </w:tc>
@@ -1299,82 +1117,31 @@
       <w:tr>
         <w:tc>
           <w:tcPr>
-            <w:tcW w:type="dxa" w:w="2500"/>
-            <w:vAlign w:val="center"/>
-            <w:tcMar>
-              <w:top w:w="80" w:type="dxa"/>
-              <w:start w:w="120" w:type="dxa"/>
-              <w:bottom w:w="80" w:type="dxa"/>
-              <w:end w:w="120" w:type="dxa"/>
-            </w:tcMar>
+            <w:tcW w:type="dxa" w:w="3312"/>
           </w:tcPr>
           <w:p>
-            <w:pPr>
-              <w:spacing w:before="0" w:after="0" w:line="276" w:lineRule="auto"/>
-            </w:pPr>
             <w:r>
-              <w:rPr>
-                <w:rFonts w:ascii="Arial" w:hAnsi="Arial" w:eastAsia="Arial"/>
-                <w:b w:val="0"/>
-                <w:i w:val="0"/>
-                <w:color w:val="000000"/>
-                <w:sz w:val="19"/>
-              </w:rPr>
               <w:t>Capped decomposition + synthesis</w:t>
             </w:r>
           </w:p>
         </w:tc>
         <w:tc>
           <w:tcPr>
-            <w:tcW w:type="dxa" w:w="3020"/>
-            <w:vAlign w:val="center"/>
-            <w:tcMar>
-              <w:top w:w="80" w:type="dxa"/>
-              <w:start w:w="120" w:type="dxa"/>
-              <w:bottom w:w="80" w:type="dxa"/>
-              <w:end w:w="120" w:type="dxa"/>
-            </w:tcMar>
+            <w:tcW w:type="dxa" w:w="3312"/>
           </w:tcPr>
           <w:p>
-            <w:pPr>
-              <w:spacing w:before="0" w:after="0" w:line="276" w:lineRule="auto"/>
-            </w:pPr>
             <w:r>
-              <w:rPr>
-                <w:rFonts w:ascii="Arial" w:hAnsi="Arial" w:eastAsia="Arial"/>
-                <w:b w:val="0"/>
-                <w:i w:val="0"/>
-                <w:color w:val="000000"/>
-                <w:sz w:val="19"/>
-              </w:rPr>
               <w:t>Could subqueries gather evidence while one final call answers the original question?</w:t>
             </w:r>
           </w:p>
         </w:tc>
         <w:tc>
           <w:tcPr>
-            <w:tcW w:type="dxa" w:w="3840"/>
-            <w:vAlign w:val="center"/>
-            <w:tcMar>
-              <w:top w:w="80" w:type="dxa"/>
-              <w:start w:w="120" w:type="dxa"/>
-              <w:bottom w:w="80" w:type="dxa"/>
-              <w:end w:w="120" w:type="dxa"/>
-            </w:tcMar>
+            <w:tcW w:type="dxa" w:w="3312"/>
           </w:tcPr>
           <w:p>
-            <w:pPr>
-              <w:spacing w:before="0" w:after="0" w:line="276" w:lineRule="auto"/>
-            </w:pPr>
             <w:r>
-              <w:rPr>
-                <w:rFonts w:ascii="Arial" w:hAnsi="Arial" w:eastAsia="Arial"/>
-                <w:b w:val="0"/>
-                <w:i w:val="0"/>
-                <w:color w:val="000000"/>
-                <w:sz w:val="19"/>
-              </w:rPr>
-              <w:t>Yes. Raw correctness rose to 0.886, the best headline score, but refusal safety remained weak.</w:t>
+              <w:t>Yes. Raw correctness rose to 0.886, the best headline score, but refusal safety stayed weak.</w:t>
             </w:r>
           </w:p>
         </w:tc>
@@ -1382,82 +1149,31 @@
       <w:tr>
         <w:tc>
           <w:tcPr>
-            <w:tcW w:type="dxa" w:w="2500"/>
-            <w:vAlign w:val="center"/>
-            <w:tcMar>
-              <w:top w:w="80" w:type="dxa"/>
-              <w:start w:w="120" w:type="dxa"/>
-              <w:bottom w:w="80" w:type="dxa"/>
-              <w:end w:w="120" w:type="dxa"/>
-            </w:tcMar>
+            <w:tcW w:type="dxa" w:w="3312"/>
           </w:tcPr>
           <w:p>
-            <w:pPr>
-              <w:spacing w:before="0" w:after="0" w:line="276" w:lineRule="auto"/>
-            </w:pPr>
             <w:r>
-              <w:rPr>
-                <w:rFonts w:ascii="Arial" w:hAnsi="Arial" w:eastAsia="Arial"/>
-                <w:b w:val="0"/>
-                <w:i w:val="0"/>
-                <w:color w:val="000000"/>
-                <w:sz w:val="19"/>
-              </w:rPr>
               <w:t>Runtime safety gate</w:t>
             </w:r>
           </w:p>
         </w:tc>
         <w:tc>
           <w:tcPr>
-            <w:tcW w:type="dxa" w:w="3020"/>
-            <w:vAlign w:val="center"/>
-            <w:tcMar>
-              <w:top w:w="80" w:type="dxa"/>
-              <w:start w:w="120" w:type="dxa"/>
-              <w:bottom w:w="80" w:type="dxa"/>
-              <w:end w:w="120" w:type="dxa"/>
-            </w:tcMar>
+            <w:tcW w:type="dxa" w:w="3312"/>
           </w:tcPr>
           <w:p>
-            <w:pPr>
-              <w:spacing w:before="0" w:after="0" w:line="276" w:lineRule="auto"/>
-            </w:pPr>
             <w:r>
-              <w:rPr>
-                <w:rFonts w:ascii="Arial" w:hAnsi="Arial" w:eastAsia="Arial"/>
-                <w:b w:val="0"/>
-                <w:i w:val="0"/>
-                <w:color w:val="000000"/>
-                <w:sz w:val="19"/>
-              </w:rPr>
               <w:t>Could safety become an enforceable pre-retrieval boundary?</w:t>
             </w:r>
           </w:p>
         </w:tc>
         <w:tc>
           <w:tcPr>
-            <w:tcW w:type="dxa" w:w="3840"/>
-            <w:vAlign w:val="center"/>
-            <w:tcMar>
-              <w:top w:w="80" w:type="dxa"/>
-              <w:start w:w="120" w:type="dxa"/>
-              <w:bottom w:w="80" w:type="dxa"/>
-              <w:end w:w="120" w:type="dxa"/>
-            </w:tcMar>
+            <w:tcW w:type="dxa" w:w="3312"/>
           </w:tcPr>
           <w:p>
-            <w:pPr>
-              <w:spacing w:before="0" w:after="0" w:line="276" w:lineRule="auto"/>
-            </w:pPr>
             <w:r>
-              <w:rPr>
-                <w:rFonts w:ascii="Arial" w:hAnsi="Arial" w:eastAsia="Arial"/>
-                <w:b w:val="0"/>
-                <w:i w:val="0"/>
-                <w:color w:val="000000"/>
-                <w:sz w:val="19"/>
-              </w:rPr>
-              <w:t>Yes. Advice leakage fell from 0.52 to 0.04 and safe redirect rose from 0.16 to 0.64.</w:t>
+              <w:t>Yes. Advice leakage fell from 0.52 to 0.04; safe redirect rose from 0.16 to 0.64.</w:t>
             </w:r>
           </w:p>
         </w:tc>
@@ -1465,82 +1181,31 @@
       <w:tr>
         <w:tc>
           <w:tcPr>
-            <w:tcW w:type="dxa" w:w="2500"/>
-            <w:vAlign w:val="center"/>
-            <w:tcMar>
-              <w:top w:w="80" w:type="dxa"/>
-              <w:start w:w="120" w:type="dxa"/>
-              <w:bottom w:w="80" w:type="dxa"/>
-              <w:end w:w="120" w:type="dxa"/>
-            </w:tcMar>
+            <w:tcW w:type="dxa" w:w="3312"/>
           </w:tcPr>
           <w:p>
-            <w:pPr>
-              <w:spacing w:before="0" w:after="0" w:line="276" w:lineRule="auto"/>
-            </w:pPr>
             <w:r>
-              <w:rPr>
-                <w:rFonts w:ascii="Arial" w:hAnsi="Arial" w:eastAsia="Arial"/>
-                <w:b w:val="0"/>
-                <w:i w:val="0"/>
-                <w:color w:val="000000"/>
-                <w:sz w:val="19"/>
-              </w:rPr>
               <w:t>LangGraph parity</w:t>
             </w:r>
           </w:p>
         </w:tc>
         <w:tc>
           <w:tcPr>
-            <w:tcW w:type="dxa" w:w="3020"/>
-            <w:vAlign w:val="center"/>
-            <w:tcMar>
-              <w:top w:w="80" w:type="dxa"/>
-              <w:start w:w="120" w:type="dxa"/>
-              <w:bottom w:w="80" w:type="dxa"/>
-              <w:end w:w="120" w:type="dxa"/>
-            </w:tcMar>
+            <w:tcW w:type="dxa" w:w="3312"/>
           </w:tcPr>
           <w:p>
-            <w:pPr>
-              <w:spacing w:before="0" w:after="0" w:line="276" w:lineRule="auto"/>
-            </w:pPr>
             <w:r>
-              <w:rPr>
-                <w:rFonts w:ascii="Arial" w:hAnsi="Arial" w:eastAsia="Arial"/>
-                <w:b w:val="0"/>
-                <w:i w:val="0"/>
-                <w:color w:val="000000"/>
-                <w:sz w:val="19"/>
-              </w:rPr>
               <w:t>Could the measured behavior move into explicit graph nodes and edges without regression?</w:t>
             </w:r>
           </w:p>
         </w:tc>
         <w:tc>
           <w:tcPr>
-            <w:tcW w:type="dxa" w:w="3840"/>
-            <w:vAlign w:val="center"/>
-            <w:tcMar>
-              <w:top w:w="80" w:type="dxa"/>
-              <w:start w:w="120" w:type="dxa"/>
-              <w:bottom w:w="80" w:type="dxa"/>
-              <w:end w:w="120" w:type="dxa"/>
-            </w:tcMar>
+            <w:tcW w:type="dxa" w:w="3312"/>
           </w:tcPr>
           <w:p>
-            <w:pPr>
-              <w:spacing w:before="0" w:after="0" w:line="276" w:lineRule="auto"/>
-            </w:pPr>
             <w:r>
-              <w:rPr>
-                <w:rFonts w:ascii="Arial" w:hAnsi="Arial" w:eastAsia="Arial"/>
-                <w:b w:val="0"/>
-                <w:i w:val="0"/>
-                <w:color w:val="000000"/>
-                <w:sz w:val="19"/>
-              </w:rPr>
-              <w:t>Yes. The graph matched or improved the safety-gated pipeline while reducing cost per query.</w:t>
+              <w:t>Yes. The graph matched or improved the safety-gated pipeline and cut cost per query.</w:t>
             </w:r>
           </w:p>
         </w:tc>
@@ -1548,82 +1213,31 @@
       <w:tr>
         <w:tc>
           <w:tcPr>
-            <w:tcW w:type="dxa" w:w="2500"/>
-            <w:vAlign w:val="center"/>
-            <w:tcMar>
-              <w:top w:w="80" w:type="dxa"/>
-              <w:start w:w="120" w:type="dxa"/>
-              <w:bottom w:w="80" w:type="dxa"/>
-              <w:end w:w="120" w:type="dxa"/>
-            </w:tcMar>
+            <w:tcW w:type="dxa" w:w="3312"/>
           </w:tcPr>
           <w:p>
-            <w:pPr>
-              <w:spacing w:before="0" w:after="0" w:line="276" w:lineRule="auto"/>
-            </w:pPr>
             <w:r>
-              <w:rPr>
-                <w:rFonts w:ascii="Arial" w:hAnsi="Arial" w:eastAsia="Arial"/>
-                <w:b w:val="0"/>
-                <w:i w:val="0"/>
-                <w:color w:val="000000"/>
-                <w:sz w:val="19"/>
-              </w:rPr>
               <w:t>Graph-final</w:t>
             </w:r>
           </w:p>
         </w:tc>
         <w:tc>
           <w:tcPr>
-            <w:tcW w:type="dxa" w:w="3020"/>
-            <w:vAlign w:val="center"/>
-            <w:tcMar>
-              <w:top w:w="80" w:type="dxa"/>
-              <w:start w:w="120" w:type="dxa"/>
-              <w:bottom w:w="80" w:type="dxa"/>
-              <w:end w:w="120" w:type="dxa"/>
-            </w:tcMar>
+            <w:tcW w:type="dxa" w:w="3312"/>
           </w:tcPr>
           <w:p>
-            <w:pPr>
-              <w:spacing w:before="0" w:after="0" w:line="276" w:lineRule="auto"/>
-            </w:pPr>
             <w:r>
-              <w:rPr>
-                <w:rFonts w:ascii="Arial" w:hAnsi="Arial" w:eastAsia="Arial"/>
-                <w:b w:val="0"/>
-                <w:i w:val="0"/>
-                <w:color w:val="000000"/>
-                <w:sz w:val="19"/>
-              </w:rPr>
-              <w:t>Could the complete graph retain every useful stage and improve the deployment decision?</w:t>
+              <w:t>Could the complete graph keep every useful stage and improve the deployment decision?</w:t>
             </w:r>
           </w:p>
         </w:tc>
         <w:tc>
           <w:tcPr>
-            <w:tcW w:type="dxa" w:w="3840"/>
-            <w:vAlign w:val="center"/>
-            <w:tcMar>
-              <w:top w:w="80" w:type="dxa"/>
-              <w:start w:w="120" w:type="dxa"/>
-              <w:bottom w:w="80" w:type="dxa"/>
-              <w:end w:w="120" w:type="dxa"/>
-            </w:tcMar>
+            <w:tcW w:type="dxa" w:w="3312"/>
           </w:tcPr>
           <w:p>
-            <w:pPr>
-              <w:spacing w:before="0" w:after="0" w:line="276" w:lineRule="auto"/>
-            </w:pPr>
             <w:r>
-              <w:rPr>
-                <w:rFonts w:ascii="Arial" w:hAnsi="Arial" w:eastAsia="Arial"/>
-                <w:b w:val="0"/>
-                <w:i w:val="0"/>
-                <w:color w:val="000000"/>
-                <w:sz w:val="19"/>
-              </w:rPr>
-              <w:t>Best safe redirect and behavior match among comparable full runs, with 4 percent advice leakage and zero pipeline errors.</w:t>
+              <w:t>Best safe redirect and behavior match among comparable full runs; 4 percent advice leakage; zero pipeline errors.</w:t>
             </w:r>
           </w:p>
         </w:tc>
@@ -1631,141 +1245,203 @@
       <w:tr>
         <w:tc>
           <w:tcPr>
-            <w:tcW w:type="dxa" w:w="2500"/>
-            <w:vAlign w:val="center"/>
-            <w:tcMar>
-              <w:top w:w="80" w:type="dxa"/>
-              <w:start w:w="120" w:type="dxa"/>
-              <w:bottom w:w="80" w:type="dxa"/>
-              <w:end w:w="120" w:type="dxa"/>
-            </w:tcMar>
+            <w:tcW w:type="dxa" w:w="3312"/>
           </w:tcPr>
           <w:p>
-            <w:pPr>
-              <w:spacing w:before="0" w:after="0" w:line="276" w:lineRule="auto"/>
-            </w:pPr>
             <w:r>
-              <w:rPr>
-                <w:rFonts w:ascii="Arial" w:hAnsi="Arial" w:eastAsia="Arial"/>
-                <w:b w:val="0"/>
-                <w:i w:val="0"/>
-                <w:color w:val="000000"/>
-                <w:sz w:val="19"/>
-              </w:rPr>
               <w:t>Privacy-hardened release</w:t>
             </w:r>
           </w:p>
         </w:tc>
         <w:tc>
           <w:tcPr>
-            <w:tcW w:type="dxa" w:w="3020"/>
-            <w:vAlign w:val="center"/>
-            <w:tcMar>
-              <w:top w:w="80" w:type="dxa"/>
-              <w:start w:w="120" w:type="dxa"/>
-              <w:bottom w:w="80" w:type="dxa"/>
-              <w:end w:w="120" w:type="dxa"/>
-            </w:tcMar>
+            <w:tcW w:type="dxa" w:w="3312"/>
           </w:tcPr>
           <w:p>
-            <w:pPr>
-              <w:spacing w:before="0" w:after="0" w:line="276" w:lineRule="auto"/>
-            </w:pPr>
             <w:r>
-              <w:rPr>
-                <w:rFonts w:ascii="Arial" w:hAnsi="Arial" w:eastAsia="Arial"/>
-                <w:b w:val="0"/>
-                <w:i w:val="0"/>
-                <w:color w:val="000000"/>
-                <w:sz w:val="19"/>
-              </w:rPr>
-              <w:t>Could a process-owned sanitizer scrub identifiers before any model sees them, without disturbing the measured safety behavior?</w:t>
+              <w:t>Could a process-owned sanitizer scrub identifiers before any model sees them without moving the safety numbers?</w:t>
             </w:r>
           </w:p>
         </w:tc>
         <w:tc>
           <w:tcPr>
-            <w:tcW w:type="dxa" w:w="3840"/>
-            <w:vAlign w:val="center"/>
-            <w:tcMar>
-              <w:top w:w="80" w:type="dxa"/>
-              <w:start w:w="120" w:type="dxa"/>
-              <w:bottom w:w="80" w:type="dxa"/>
-              <w:end w:w="120" w:type="dxa"/>
-            </w:tcMar>
+            <w:tcW w:type="dxa" w:w="3312"/>
           </w:tcPr>
           <w:p>
-            <w:pPr>
-              <w:spacing w:before="0" w:after="0" w:line="276" w:lineRule="auto"/>
-            </w:pPr>
             <w:r>
-              <w:rPr>
-                <w:rFonts w:ascii="Arial" w:hAnsi="Arial" w:eastAsia="Arial"/>
-                <w:b w:val="0"/>
-                <w:i w:val="0"/>
-                <w:color w:val="000000"/>
-                <w:sz w:val="19"/>
-              </w:rPr>
-              <w:t>Yes. Presidio plus deterministic healthcare-ID patterns scrub query, history, answers, and follow-ups; behavior metrics held identical and hallucinated improved 0.643 to 0.538 on the safety categories.</w:t>
+              <w:t>Yes. Behavior metrics held identical; hallucinated improved 0.643 to 0.538 on the safety categories.</w:t>
+            </w:r>
+          </w:p>
+        </w:tc>
+      </w:tr>
+      <w:tr>
+        <w:tc>
+          <w:tcPr>
+            <w:tcW w:type="dxa" w:w="3312"/>
+          </w:tcPr>
+          <w:p>
+            <w:r>
+              <w:t>Persisted refusal boundary</w:t>
+            </w:r>
+          </w:p>
+        </w:tc>
+        <w:tc>
+          <w:tcPr>
+            <w:tcW w:type="dxa" w:w="3312"/>
+          </w:tcPr>
+          <w:p>
+            <w:r>
+              <w:t>Could a refusal survive across turns instead of being re-rolled each turn?</w:t>
+            </w:r>
+          </w:p>
+        </w:tc>
+        <w:tc>
+          <w:tcPr>
+            <w:tcW w:type="dxa" w:w="3312"/>
+          </w:tcPr>
+          <w:p>
+            <w:r>
+              <w:t>Yes. Safety drift 0.409 to 0.273 (median of 3), PII persistence 0.19 to 0.125, zero replay-precision violations, n = 22.</w:t>
+            </w:r>
+          </w:p>
+        </w:tc>
+      </w:tr>
+      <w:tr>
+        <w:tc>
+          <w:tcPr>
+            <w:tcW w:type="dxa" w:w="3312"/>
+          </w:tcPr>
+          <w:p>
+            <w:r>
+              <w:t>PageIndex tree-search retrieval</w:t>
+            </w:r>
+          </w:p>
+        </w:tc>
+        <w:tc>
+          <w:tcPr>
+            <w:tcW w:type="dxa" w:w="3312"/>
+          </w:tcPr>
+          <w:p>
+            <w:r>
+              <w:t>Does reasoning over a document tree beat hybrid search on this corpus?</w:t>
+            </w:r>
+          </w:p>
+        </w:tc>
+        <w:tc>
+          <w:tcPr>
+            <w:tcW w:type="dxa" w:w="3312"/>
+          </w:tcPr>
+          <w:p>
+            <w:r>
+              <w:t>No. Page recall 0.609 against 0.681 (71 questions); 2x retrieval latency; rejected at stage 1.</w:t>
+            </w:r>
+          </w:p>
+        </w:tc>
+      </w:tr>
+      <w:tr>
+        <w:tc>
+          <w:tcPr>
+            <w:tcW w:type="dxa" w:w="3312"/>
+          </w:tcPr>
+          <w:p>
+            <w:r>
+              <w:t>Pinecone hybrid retrieval</w:t>
+            </w:r>
+          </w:p>
+        </w:tc>
+        <w:tc>
+          <w:tcPr>
+            <w:tcW w:type="dxa" w:w="3312"/>
+          </w:tcPr>
+          <w:p>
+            <w:r>
+              <w:t>Does a managed vector index with the same embeddings beat Weaviate?</w:t>
+            </w:r>
+          </w:p>
+        </w:tc>
+        <w:tc>
+          <w:tcPr>
+            <w:tcW w:type="dxa" w:w="3312"/>
+          </w:tcPr>
+          <w:p>
+            <w:r>
+              <w:t>Not as configured. 0.463 against 0.648; dense-only 0.607 against 0.664; rejected at stage 1.</w:t>
+            </w:r>
+          </w:p>
+        </w:tc>
+      </w:tr>
+      <w:tr>
+        <w:tc>
+          <w:tcPr>
+            <w:tcW w:type="dxa" w:w="3312"/>
+          </w:tcPr>
+          <w:p>
+            <w:r>
+              <w:t>Reranker over Weaviate (bge-reranker-v2-m3, 12 to 4)</w:t>
+            </w:r>
+          </w:p>
+        </w:tc>
+        <w:tc>
+          <w:tcPr>
+            <w:tcW w:type="dxa" w:w="3312"/>
+          </w:tcPr>
+          <w:p>
+            <w:r>
+              <w:t>Does reranking the top 12 improve answers?</w:t>
+            </w:r>
+          </w:p>
+        </w:tc>
+        <w:tc>
+          <w:tcPr>
+            <w:tcW w:type="dxa" w:w="3312"/>
+          </w:tcPr>
+          <w:p>
+            <w:r>
+              <w:t>It improved page recall (+0.050) and hurt correctness (0.799 against 0.850; holdout 0.737 against 0.828). Rejected at stage 2.</w:t>
             </w:r>
           </w:p>
         </w:tc>
       </w:tr>
     </w:tbl>
+    <w:p/>
     <w:p>
       <w:pPr>
         <w:pStyle w:val="Heading2"/>
       </w:pPr>
       <w:r>
-        <w:t>Comparable full-run metrics</w:t>
+        <w:t>Comparable full-run metrics (86 examples, GPT-5.6 Sol judge)</w:t>
       </w:r>
     </w:p>
     <w:p>
+      <w:pPr>
+        <w:pStyle w:val="ListBullet"/>
+      </w:pPr>
       <w:r>
-        <w:rPr>
-          <w:rFonts w:ascii="Arial" w:hAnsi="Arial" w:eastAsia="Arial"/>
-          <w:b w:val="0"/>
-          <w:i w:val="0"/>
-          <w:color w:val="000000"/>
-          <w:sz w:val="22"/>
-        </w:rPr>
-        <w:t>Synthesis: correctness 0.886; groundedness 0.925; safe redirect 0.16; advice leakage 0.52; behavior match 0.791; p50 latency 15.90 seconds; cost $0.0284 per query.</w:t>
+        <w:t>Synthesis: correctness 0.886; groundedness 0.925; safe redirect 0.16; advice leakage 0.52; behavior match 0.791; p50 15.90 s; $0.0284 per query.</w:t>
       </w:r>
     </w:p>
     <w:p>
+      <w:pPr>
+        <w:pStyle w:val="ListBullet"/>
+      </w:pPr>
       <w:r>
-        <w:rPr>
-          <w:rFonts w:ascii="Arial" w:hAnsi="Arial" w:eastAsia="Arial"/>
-          <w:b w:val="0"/>
-          <w:i w:val="0"/>
-          <w:color w:val="000000"/>
-          <w:sz w:val="22"/>
-        </w:rPr>
-        <w:t>Safety-gated: correctness 0.813; groundedness 0.950; safe redirect 0.64; advice leakage 0.04; behavior match 0.872; p50 latency 12.20 seconds; cost $0.0195 per query.</w:t>
+        <w:t>Safety-gated: correctness 0.813; groundedness 0.950; safe redirect 0.64; advice leakage 0.04; behavior match 0.872; p50 12.20 s; $0.0195 per query.</w:t>
       </w:r>
     </w:p>
     <w:p>
+      <w:pPr>
+        <w:pStyle w:val="ListBullet"/>
+      </w:pPr>
       <w:r>
-        <w:rPr>
-          <w:rFonts w:ascii="Arial" w:hAnsi="Arial" w:eastAsia="Arial"/>
-          <w:b w:val="0"/>
-          <w:i w:val="0"/>
-          <w:color w:val="000000"/>
-          <w:sz w:val="22"/>
-        </w:rPr>
-        <w:t>Graph parity: correctness 0.855; groundedness 0.951; safe redirect 0.64; advice leakage 0.04; behavior match 0.895; p50 latency 15.35 seconds; cost $0.0170 per query.</w:t>
+        <w:t>Graph parity: correctness 0.855; groundedness 0.951; safe redirect 0.64; advice leakage 0.04; behavior match 0.895; p50 15.35 s; $0.0170 per query.</w:t>
       </w:r>
     </w:p>
     <w:p>
+      <w:pPr>
+        <w:pStyle w:val="ListBullet"/>
+      </w:pPr>
       <w:r>
-        <w:rPr>
-          <w:rFonts w:ascii="Arial" w:hAnsi="Arial" w:eastAsia="Arial"/>
-          <w:b w:val="0"/>
-          <w:i w:val="0"/>
-          <w:color w:val="000000"/>
-          <w:sz w:val="22"/>
-        </w:rPr>
-        <w:t>Graph-final: correctness 0.853; groundedness 0.935; safe redirect 0.68; advice leakage 0.04; behavior match 0.907; p50 latency 16.38 seconds; cost $0.0191 per query; pipeline error rate 0.00.</w:t>
+        <w:t>Graph-final: correctness 0.853; groundedness 0.935; safe redirect 0.68; advice leakage 0.04; behavior match 0.907; p50 16.38 s; $0.0191 per query; pipeline error rate 0.00.</w:t>
       </w:r>
     </w:p>
     <w:p>
@@ -1777,179 +1453,67 @@
       </w:r>
     </w:p>
     <w:p>
+      <w:pPr>
+        <w:pStyle w:val="ListBullet"/>
+      </w:pPr>
       <w:r>
-        <w:rPr>
-          <w:rFonts w:ascii="Arial" w:hAnsi="Arial" w:eastAsia="Arial"/>
-          <w:b/>
-          <w:i w:val="0"/>
-          <w:color w:val="000000"/>
-          <w:sz w:val="22"/>
-        </w:rPr>
-        <w:t xml:space="preserve">Safety gate. </w:t>
-      </w:r>
-      <w:r>
-        <w:rPr>
-          <w:rFonts w:ascii="Arial" w:hAnsi="Arial" w:eastAsia="Arial"/>
-          <w:b w:val="0"/>
-          <w:i w:val="0"/>
-          <w:color w:val="000000"/>
-          <w:sz w:val="22"/>
-        </w:rPr>
-        <w:t>Scrub identifiers, classify the request, and short-circuit emergencies, personal advice, out-of-scope requests, prompt injection, and identifier-recitation requests.</w:t>
+        <w:t>Safety gate. Scrub identifiers, classify the request, short-circuit emergencies, personal advice, out-of-scope requests, prompt injection and identifier-recitation requests. A stored refusal boundary is checked first and replayed with zero LLM calls when it matches.</w:t>
       </w:r>
     </w:p>
     <w:p>
+      <w:pPr>
+        <w:pStyle w:val="ListBullet"/>
+      </w:pPr>
       <w:r>
-        <w:rPr>
-          <w:rFonts w:ascii="Arial" w:hAnsi="Arial" w:eastAsia="Arial"/>
-          <w:b/>
-          <w:i w:val="0"/>
-          <w:color w:val="000000"/>
-          <w:sz w:val="22"/>
-        </w:rPr>
-        <w:t xml:space="preserve">Clarification and conversation context. </w:t>
-      </w:r>
-      <w:r>
-        <w:rPr>
-          <w:rFonts w:ascii="Arial" w:hAnsi="Arial" w:eastAsia="Arial"/>
-          <w:b w:val="0"/>
-          <w:i w:val="0"/>
-          <w:color w:val="000000"/>
-          <w:sz w:val="22"/>
-        </w:rPr>
-        <w:t>Run in parallel against scrubbed checkpointed history.</w:t>
+        <w:t>Clarification and conversation context, in parallel, over scrubbed checkpointed history.</w:t>
       </w:r>
     </w:p>
     <w:p>
+      <w:pPr>
+        <w:pStyle w:val="ListBullet"/>
+      </w:pPr>
       <w:r>
-        <w:rPr>
-          <w:rFonts w:ascii="Arial" w:hAnsi="Arial" w:eastAsia="Arial"/>
-          <w:b/>
-          <w:i w:val="0"/>
-          <w:color w:val="000000"/>
-          <w:sz w:val="22"/>
-        </w:rPr>
-        <w:t xml:space="preserve">Complex-only decomposition. </w:t>
-      </w:r>
-      <w:r>
-        <w:rPr>
-          <w:rFonts w:ascii="Arial" w:hAnsi="Arial" w:eastAsia="Arial"/>
-          <w:b w:val="0"/>
-          <w:i w:val="0"/>
-          <w:color w:val="000000"/>
-          <w:sz w:val="22"/>
-        </w:rPr>
-        <w:t>Always retain the parent query and add no more than three evidence-gathering subqueries.</w:t>
+        <w:t>Complex-only decomposition. Keep the parent query; add at most three evidence-gathering subqueries.</w:t>
       </w:r>
     </w:p>
     <w:p>
+      <w:pPr>
+        <w:pStyle w:val="ListBullet"/>
+      </w:pPr>
       <w:r>
-        <w:rPr>
-          <w:rFonts w:ascii="Arial" w:hAnsi="Arial" w:eastAsia="Arial"/>
-          <w:b/>
-          <w:i w:val="0"/>
-          <w:color w:val="000000"/>
-          <w:sz w:val="22"/>
-        </w:rPr>
-        <w:t xml:space="preserve">Hybrid retrieval and merge. </w:t>
-      </w:r>
-      <w:r>
-        <w:rPr>
-          <w:rFonts w:ascii="Arial" w:hAnsi="Arial" w:eastAsia="Arial"/>
-          <w:b w:val="0"/>
-          <w:i w:val="0"/>
-          <w:color w:val="000000"/>
-          <w:sz w:val="22"/>
-        </w:rPr>
-        <w:t>Search the Lipitor and Metformin monographs, then deduplicate documents by identifier.</w:t>
+        <w:t>Hybrid retrieval and merge over the Lipitor and Metformin monographs, deduplicated by document id.</w:t>
       </w:r>
     </w:p>
     <w:p>
+      <w:pPr>
+        <w:pStyle w:val="ListBullet"/>
+      </w:pPr>
       <w:r>
-        <w:rPr>
-          <w:rFonts w:ascii="Arial" w:hAnsi="Arial" w:eastAsia="Arial"/>
-          <w:b/>
-          <w:i w:val="0"/>
-          <w:color w:val="000000"/>
-          <w:sz w:val="22"/>
-        </w:rPr>
-        <w:t xml:space="preserve">Retrieval evaluation. </w:t>
-      </w:r>
-      <w:r>
-        <w:rPr>
-          <w:rFonts w:ascii="Arial" w:hAnsi="Arial" w:eastAsia="Arial"/>
-          <w:b w:val="0"/>
-          <w:i w:val="0"/>
-          <w:color w:val="000000"/>
-          <w:sz w:val="22"/>
-        </w:rPr>
-        <w:t>Allow one bounded gap-fill round when the evidence is insufficient.</w:t>
+        <w:t>Retrieval evaluation with one bounded gap-fill round when evidence is thin.</w:t>
       </w:r>
     </w:p>
     <w:p>
+      <w:pPr>
+        <w:pStyle w:val="ListBullet"/>
+      </w:pPr>
       <w:r>
-        <w:rPr>
-          <w:rFonts w:ascii="Arial" w:hAnsi="Arial" w:eastAsia="Arial"/>
-          <w:b/>
-          <w:i w:val="0"/>
-          <w:color w:val="000000"/>
-          <w:sz w:val="22"/>
-        </w:rPr>
-        <w:t xml:space="preserve">Generate once. </w:t>
-      </w:r>
-      <w:r>
-        <w:rPr>
-          <w:rFonts w:ascii="Arial" w:hAnsi="Arial" w:eastAsia="Arial"/>
-          <w:b w:val="0"/>
-          <w:i w:val="0"/>
-          <w:color w:val="000000"/>
-          <w:sz w:val="22"/>
-        </w:rPr>
-        <w:t>Answer the original question over the merged evidence.</w:t>
+        <w:t>Generate once, answering the original question over the merged evidence.</w:t>
       </w:r>
     </w:p>
     <w:p>
+      <w:pPr>
+        <w:pStyle w:val="ListBullet"/>
+      </w:pPr>
       <w:r>
-        <w:rPr>
-          <w:rFonts w:ascii="Arial" w:hAnsi="Arial" w:eastAsia="Arial"/>
-          <w:b/>
-          <w:i w:val="0"/>
-          <w:color w:val="000000"/>
-          <w:sz w:val="22"/>
-        </w:rPr>
-        <w:t xml:space="preserve">Validate and follow up. </w:t>
-      </w:r>
-      <w:r>
-        <w:rPr>
-          <w:rFonts w:ascii="Arial" w:hAnsi="Arial" w:eastAsia="Arial"/>
-          <w:b w:val="0"/>
-          <w:i w:val="0"/>
-          <w:color w:val="000000"/>
-          <w:sz w:val="22"/>
-        </w:rPr>
-        <w:t>Structure citations with Terra and generate follow-ups only for validated answers.</w:t>
+        <w:t>Validate and follow up: citations structured with Terra; follow-ups only for validated answers.</w:t>
       </w:r>
     </w:p>
     <w:p>
+      <w:pPr>
+        <w:pStyle w:val="ListBullet"/>
+      </w:pPr>
       <w:r>
-        <w:rPr>
-          <w:rFonts w:ascii="Arial" w:hAnsi="Arial" w:eastAsia="Arial"/>
-          <w:b/>
-          <w:i w:val="0"/>
-          <w:color w:val="000000"/>
-          <w:sz w:val="22"/>
-        </w:rPr>
-        <w:t xml:space="preserve">Finalize. </w:t>
-      </w:r>
-      <w:r>
-        <w:rPr>
-          <w:rFonts w:ascii="Arial" w:hAnsi="Arial" w:eastAsia="Arial"/>
-          <w:b w:val="0"/>
-          <w:i w:val="0"/>
-          <w:color w:val="000000"/>
-          <w:sz w:val="22"/>
-        </w:rPr>
-        <w:t>Persist only the scrubbed conversation pair and return graph telemetry.</w:t>
+        <w:t>Finalize: persist only the scrubbed conversation pair and return graph telemetry.</w:t>
       </w:r>
     </w:p>
     <w:p>
@@ -1957,67 +1521,47 @@
         <w:pStyle w:val="Heading2"/>
       </w:pPr>
       <w:r>
-        <w:t>Ablation results</w:t>
+        <w:t>Ablation results (correctness)</w:t>
       </w:r>
     </w:p>
     <w:p>
+      <w:pPr>
+        <w:pStyle w:val="ListBullet"/>
+      </w:pPr>
       <w:r>
-        <w:rPr>
-          <w:rFonts w:ascii="Arial" w:hAnsi="Arial" w:eastAsia="Arial"/>
-          <w:b w:val="0"/>
-          <w:i w:val="0"/>
-          <w:color w:val="000000"/>
-          <w:sz w:val="22"/>
-        </w:rPr>
-        <w:t>No evaluate: correctness 0.741. This was the largest quality loss.</w:t>
+        <w:t>No evaluate: 0.741, the largest loss.</w:t>
       </w:r>
     </w:p>
     <w:p>
+      <w:pPr>
+        <w:pStyle w:val="ListBullet"/>
+      </w:pPr>
       <w:r>
-        <w:rPr>
-          <w:rFonts w:ascii="Arial" w:hAnsi="Arial" w:eastAsia="Arial"/>
-          <w:b w:val="0"/>
-          <w:i w:val="0"/>
-          <w:color w:val="000000"/>
-          <w:sz w:val="22"/>
-        </w:rPr>
-        <w:t>No clarify: correctness 0.814. Quality fell on both core and holdout cases.</w:t>
+        <w:t>No clarify: 0.814; both core and holdout fell.</w:t>
       </w:r>
     </w:p>
     <w:p>
+      <w:pPr>
+        <w:pStyle w:val="ListBullet"/>
+      </w:pPr>
       <w:r>
-        <w:rPr>
-          <w:rFonts w:ascii="Arial" w:hAnsi="Arial" w:eastAsia="Arial"/>
-          <w:b w:val="0"/>
-          <w:i w:val="0"/>
-          <w:color w:val="000000"/>
-          <w:sz w:val="22"/>
-        </w:rPr>
-        <w:t>No decompose: correctness 0.838. The overall loss was modest, with a larger holdout loss.</w:t>
+        <w:t>No decompose: 0.838; small overall loss, larger on holdout.</w:t>
       </w:r>
     </w:p>
     <w:p>
+      <w:pPr>
+        <w:pStyle w:val="ListBullet"/>
+      </w:pPr>
       <w:r>
-        <w:rPr>
-          <w:rFonts w:ascii="Arial" w:hAnsi="Arial" w:eastAsia="Arial"/>
-          <w:b w:val="0"/>
-          <w:i w:val="0"/>
-          <w:color w:val="000000"/>
-          <w:sz w:val="22"/>
-        </w:rPr>
-        <w:t>No validate: correctness 0.852. Correctness held, but hallucination and premise correction worsened.</w:t>
+        <w:t>No validate: 0.852; correctness held but hallucination and premise correction worsened.</w:t>
       </w:r>
     </w:p>
     <w:p>
+      <w:pPr>
+        <w:pStyle w:val="ListBullet"/>
+      </w:pPr>
       <w:r>
-        <w:rPr>
-          <w:rFonts w:ascii="Arial" w:hAnsi="Arial" w:eastAsia="Arial"/>
-          <w:b w:val="0"/>
-          <w:i w:val="0"/>
-          <w:color w:val="000000"/>
-          <w:sz w:val="22"/>
-        </w:rPr>
-        <w:t>No follow-ups: correctness 0.855. This stage is answer-neutral and serves the user experience.</w:t>
+        <w:t>No follow-ups: 0.855; answer-neutral.</w:t>
       </w:r>
     </w:p>
     <w:p>
@@ -2025,55 +1569,1036 @@
         <w:pStyle w:val="Heading2"/>
       </w:pPr>
       <w:r>
-        <w:t>Exact-commit multi-turn result</w:t>
+        <w:t>Multi-turn: graph-final and the persisted refusal boundary</w:t>
+      </w:r>
+    </w:p>
+    <w:p>
+      <w:pPr>
+        <w:pStyle w:val="ListBullet"/>
+      </w:pPr>
+      <w:r>
+        <w:t>Graph-final exact commit (22 conversations, 158 planned turns, zero execution errors): safety drift 0.4091; PII persistence 0.1875; emergency escalation 1.0; turn behavior match 0.9396; turn correctness 0.8072; groundedness 0.9224; context carry-over 0.8856; consistency 0.8182; $0.106 per conversation.</w:t>
+      </w:r>
+    </w:p>
+    <w:p>
+      <w:pPr>
+        <w:pStyle w:val="ListBullet"/>
+      </w:pPr>
+      <w:r>
+        <w:t>Boundary on (run boundary-on-r4-aeb73d36, verdict in evals/results/boundary-verdict/verdict.md): safety drift median of 3 judge reruns 0.2727 (bar 0.364; normal-approximation 95% interval 0.087 to 0.459); PII persistence 0.125; turn correctness 0.8018 and behavior match 0.9214, both inside the 0.05 non-regression bar; emergency escalation 1.0; replay-precision violations 0 across 21 scripted conversations; $0.015 per turn.</w:t>
+      </w:r>
+    </w:p>
+    <w:p>
+      <w:pPr>
+        <w:pStyle w:val="ListBullet"/>
+      </w:pPr>
+      <w:r>
+        <w:t>What the boundary stores: refusal kind, derived drug topic, the byte-exact template, a timestamp and a template version. No raw user text, no PHI spans. Stored boundaries only ever escalate. An informational override sends document-sourced wording back through the full gate so factual follow-ups on a refused topic stay answerable. Conversations mt-017 to mt-021 pin the behaviour.</w:t>
+      </w:r>
+    </w:p>
+    <w:p>
+      <w:pPr>
+        <w:pStyle w:val="Heading2"/>
+      </w:pPr>
+      <w:r>
+        <w:t>Retrieval experiments (direction 5 applied to the retriever)</w:t>
       </w:r>
     </w:p>
     <w:p>
       <w:r>
         <w:rPr>
-          <w:rFonts w:ascii="Arial" w:hAnsi="Arial" w:eastAsia="Arial"/>
           <w:b w:val="0"/>
           <w:i w:val="0"/>
-          <w:color w:val="000000"/>
-          <w:sz w:val="22"/>
         </w:rPr>
-        <w:t>Evaluation set: 22 conversations and 158 planned turns; zero execution errors.</w:t>
+        <w:t>Method: retrieval stage only, everything downstream byte-identical. Stage 1 is a retrieval-only page-recall gate over 71 eligible golden questions (8 have no expected pages, 7 are multi-turn), about 3 minutes per arm. Losing page recall to the reference is terminal. The best passer goes to stage 2: paired evals.run_baseline runs, core plus holdout, 2 repetitions, n = 172 per arm, against a fresh Weaviate reference in the same session. Stage-2 pass needs correctness +0.03 with groundedness, holdout correctness, cost (1.25x) and p50 (1.25x) held. Thresholds were frozen in a spec before any result; a self-check with identical arms gave a delta of 0.000. The unchanged reference scored 0.681, 0.648 and 0.664 across three same-day runs, so unpaired comparisons were never allowed.</w:t>
+      </w:r>
+    </w:p>
+    <w:tbl>
+      <w:tblPr>
+        <w:tblStyle w:val="LightGrid-Accent2"/>
+        <w:tblW w:type="auto" w:w="0"/>
+        <w:tblLook w:firstColumn="1" w:firstRow="1" w:lastColumn="0" w:lastRow="0" w:noHBand="0" w:noVBand="1" w:val="04A0"/>
+      </w:tblPr>
+      <w:tblGrid>
+        <w:gridCol w:w="1419"/>
+        <w:gridCol w:w="1419"/>
+        <w:gridCol w:w="1419"/>
+        <w:gridCol w:w="1419"/>
+        <w:gridCol w:w="1419"/>
+        <w:gridCol w:w="1419"/>
+        <w:gridCol w:w="1419"/>
+      </w:tblGrid>
+      <w:tr>
+        <w:tc>
+          <w:tcPr>
+            <w:tcW w:type="dxa" w:w="1419"/>
+          </w:tcPr>
+          <w:p>
+            <w:r>
+              <w:rPr>
+                <w:b/>
+              </w:rPr>
+              <w:t>Arm</w:t>
+            </w:r>
+          </w:p>
+        </w:tc>
+        <w:tc>
+          <w:tcPr>
+            <w:tcW w:type="dxa" w:w="1419"/>
+          </w:tcPr>
+          <w:p>
+            <w:r>
+              <w:rPr>
+                <w:b/>
+              </w:rPr>
+              <w:t>Stage-1 page recall</w:t>
+            </w:r>
+          </w:p>
+        </w:tc>
+        <w:tc>
+          <w:tcPr>
+            <w:tcW w:type="dxa" w:w="1419"/>
+          </w:tcPr>
+          <w:p>
+            <w:r>
+              <w:rPr>
+                <w:b/>
+              </w:rPr>
+              <w:t>Delta</w:t>
+            </w:r>
+          </w:p>
+        </w:tc>
+        <w:tc>
+          <w:tcPr>
+            <w:tcW w:type="dxa" w:w="1419"/>
+          </w:tcPr>
+          <w:p>
+            <w:r>
+              <w:rPr>
+                <w:b/>
+              </w:rPr>
+              <w:t>Core / holdout</w:t>
+            </w:r>
+          </w:p>
+        </w:tc>
+        <w:tc>
+          <w:tcPr>
+            <w:tcW w:type="dxa" w:w="1419"/>
+          </w:tcPr>
+          <w:p>
+            <w:r>
+              <w:rPr>
+                <w:b/>
+              </w:rPr>
+              <w:t>Chunk recall</w:t>
+            </w:r>
+          </w:p>
+        </w:tc>
+        <w:tc>
+          <w:tcPr>
+            <w:tcW w:type="dxa" w:w="1419"/>
+          </w:tcPr>
+          <w:p>
+            <w:r>
+              <w:rPr>
+                <w:b/>
+              </w:rPr>
+              <w:t>Retrieval latency</w:t>
+            </w:r>
+          </w:p>
+        </w:tc>
+        <w:tc>
+          <w:tcPr>
+            <w:tcW w:type="dxa" w:w="1419"/>
+          </w:tcPr>
+          <w:p>
+            <w:r>
+              <w:rPr>
+                <w:b/>
+              </w:rPr>
+              <w:t>Verdict</w:t>
+            </w:r>
+          </w:p>
+        </w:tc>
+      </w:tr>
+      <w:tr>
+        <w:tc>
+          <w:tcPr>
+            <w:tcW w:type="dxa" w:w="1419"/>
+          </w:tcPr>
+          <w:p>
+            <w:r>
+              <w:t>Weaviate hybrid (reference, PageIndex session)</w:t>
+            </w:r>
+          </w:p>
+        </w:tc>
+        <w:tc>
+          <w:tcPr>
+            <w:tcW w:type="dxa" w:w="1419"/>
+          </w:tcPr>
+          <w:p>
+            <w:r>
+              <w:t>0.681</w:t>
+            </w:r>
+          </w:p>
+        </w:tc>
+        <w:tc>
+          <w:tcPr>
+            <w:tcW w:type="dxa" w:w="1419"/>
+          </w:tcPr>
+          <w:p>
+            <w:r/>
+          </w:p>
+        </w:tc>
+        <w:tc>
+          <w:tcPr>
+            <w:tcW w:type="dxa" w:w="1419"/>
+          </w:tcPr>
+          <w:p>
+            <w:r>
+              <w:t>0.685 / 0.676</w:t>
+            </w:r>
+          </w:p>
+        </w:tc>
+        <w:tc>
+          <w:tcPr>
+            <w:tcW w:type="dxa" w:w="1419"/>
+          </w:tcPr>
+          <w:p>
+            <w:r>
+              <w:t>0.618</w:t>
+            </w:r>
+          </w:p>
+        </w:tc>
+        <w:tc>
+          <w:tcPr>
+            <w:tcW w:type="dxa" w:w="1419"/>
+          </w:tcPr>
+          <w:p>
+            <w:r>
+              <w:t>1.66 s</w:t>
+            </w:r>
+          </w:p>
+        </w:tc>
+        <w:tc>
+          <w:tcPr>
+            <w:tcW w:type="dxa" w:w="1419"/>
+          </w:tcPr>
+          <w:p>
+            <w:r>
+              <w:t>kept</w:t>
+            </w:r>
+          </w:p>
+        </w:tc>
+      </w:tr>
+      <w:tr>
+        <w:tc>
+          <w:tcPr>
+            <w:tcW w:type="dxa" w:w="1419"/>
+          </w:tcPr>
+          <w:p>
+            <w:r>
+              <w:t>PageIndex tree search</w:t>
+            </w:r>
+          </w:p>
+        </w:tc>
+        <w:tc>
+          <w:tcPr>
+            <w:tcW w:type="dxa" w:w="1419"/>
+          </w:tcPr>
+          <w:p>
+            <w:r>
+              <w:t>0.609</w:t>
+            </w:r>
+          </w:p>
+        </w:tc>
+        <w:tc>
+          <w:tcPr>
+            <w:tcW w:type="dxa" w:w="1419"/>
+          </w:tcPr>
+          <w:p>
+            <w:r>
+              <w:t>-0.071</w:t>
+            </w:r>
+          </w:p>
+        </w:tc>
+        <w:tc>
+          <w:tcPr>
+            <w:tcW w:type="dxa" w:w="1419"/>
+          </w:tcPr>
+          <w:p>
+            <w:r>
+              <w:t>0.637 / 0.581</w:t>
+            </w:r>
+          </w:p>
+        </w:tc>
+        <w:tc>
+          <w:tcPr>
+            <w:tcW w:type="dxa" w:w="1419"/>
+          </w:tcPr>
+          <w:p>
+            <w:r>
+              <w:t>0.601</w:t>
+            </w:r>
+          </w:p>
+        </w:tc>
+        <w:tc>
+          <w:tcPr>
+            <w:tcW w:type="dxa" w:w="1419"/>
+          </w:tcPr>
+          <w:p>
+            <w:r>
+              <w:t>3.10 s</w:t>
+            </w:r>
+          </w:p>
+        </w:tc>
+        <w:tc>
+          <w:tcPr>
+            <w:tcW w:type="dxa" w:w="1419"/>
+          </w:tcPr>
+          <w:p>
+            <w:r>
+              <w:t>REJECT, stage 1</w:t>
+            </w:r>
+          </w:p>
+        </w:tc>
+      </w:tr>
+      <w:tr>
+        <w:tc>
+          <w:tcPr>
+            <w:tcW w:type="dxa" w:w="1419"/>
+          </w:tcPr>
+          <w:p>
+            <w:r>
+              <w:t>Weaviate hybrid (reference, Pinecone session)</w:t>
+            </w:r>
+          </w:p>
+        </w:tc>
+        <w:tc>
+          <w:tcPr>
+            <w:tcW w:type="dxa" w:w="1419"/>
+          </w:tcPr>
+          <w:p>
+            <w:r>
+              <w:t>0.648</w:t>
+            </w:r>
+          </w:p>
+        </w:tc>
+        <w:tc>
+          <w:tcPr>
+            <w:tcW w:type="dxa" w:w="1419"/>
+          </w:tcPr>
+          <w:p>
+            <w:r/>
+          </w:p>
+        </w:tc>
+        <w:tc>
+          <w:tcPr>
+            <w:tcW w:type="dxa" w:w="1419"/>
+          </w:tcPr>
+          <w:p>
+            <w:r>
+              <w:t>0.666 / 0.629</w:t>
+            </w:r>
+          </w:p>
+        </w:tc>
+        <w:tc>
+          <w:tcPr>
+            <w:tcW w:type="dxa" w:w="1419"/>
+          </w:tcPr>
+          <w:p>
+            <w:r>
+              <w:t>0.587</w:t>
+            </w:r>
+          </w:p>
+        </w:tc>
+        <w:tc>
+          <w:tcPr>
+            <w:tcW w:type="dxa" w:w="1419"/>
+          </w:tcPr>
+          <w:p>
+            <w:r>
+              <w:t>2.32 s</w:t>
+            </w:r>
+          </w:p>
+        </w:tc>
+        <w:tc>
+          <w:tcPr>
+            <w:tcW w:type="dxa" w:w="1419"/>
+          </w:tcPr>
+          <w:p>
+            <w:r>
+              <w:t>kept</w:t>
+            </w:r>
+          </w:p>
+        </w:tc>
+      </w:tr>
+      <w:tr>
+        <w:tc>
+          <w:tcPr>
+            <w:tcW w:type="dxa" w:w="1419"/>
+          </w:tcPr>
+          <w:p>
+            <w:r>
+              <w:t>Pinecone hybrid (same embeddings + hosted sparse, alpha 0.65)</w:t>
+            </w:r>
+          </w:p>
+        </w:tc>
+        <w:tc>
+          <w:tcPr>
+            <w:tcW w:type="dxa" w:w="1419"/>
+          </w:tcPr>
+          <w:p>
+            <w:r>
+              <w:t>0.463</w:t>
+            </w:r>
+          </w:p>
+        </w:tc>
+        <w:tc>
+          <w:tcPr>
+            <w:tcW w:type="dxa" w:w="1419"/>
+          </w:tcPr>
+          <w:p>
+            <w:r>
+              <w:t>-0.185</w:t>
+            </w:r>
+          </w:p>
+        </w:tc>
+        <w:tc>
+          <w:tcPr>
+            <w:tcW w:type="dxa" w:w="1419"/>
+          </w:tcPr>
+          <w:p>
+            <w:r>
+              <w:t>0.450 / 0.476</w:t>
+            </w:r>
+          </w:p>
+        </w:tc>
+        <w:tc>
+          <w:tcPr>
+            <w:tcW w:type="dxa" w:w="1419"/>
+          </w:tcPr>
+          <w:p>
+            <w:r>
+              <w:t>0.417</w:t>
+            </w:r>
+          </w:p>
+        </w:tc>
+        <w:tc>
+          <w:tcPr>
+            <w:tcW w:type="dxa" w:w="1419"/>
+          </w:tcPr>
+          <w:p>
+            <w:r>
+              <w:t>2.30 s</w:t>
+            </w:r>
+          </w:p>
+        </w:tc>
+        <w:tc>
+          <w:tcPr>
+            <w:tcW w:type="dxa" w:w="1419"/>
+          </w:tcPr>
+          <w:p>
+            <w:r>
+              <w:t>REJECT, stage 1</w:t>
+            </w:r>
+          </w:p>
+        </w:tc>
+      </w:tr>
+      <w:tr>
+        <w:tc>
+          <w:tcPr>
+            <w:tcW w:type="dxa" w:w="1419"/>
+          </w:tcPr>
+          <w:p>
+            <w:r>
+              <w:t>Pinecone dense-only (labelled diagnostic, reference 0.664)</w:t>
+            </w:r>
+          </w:p>
+        </w:tc>
+        <w:tc>
+          <w:tcPr>
+            <w:tcW w:type="dxa" w:w="1419"/>
+          </w:tcPr>
+          <w:p>
+            <w:r>
+              <w:t>0.607</w:t>
+            </w:r>
+          </w:p>
+        </w:tc>
+        <w:tc>
+          <w:tcPr>
+            <w:tcW w:type="dxa" w:w="1419"/>
+          </w:tcPr>
+          <w:p>
+            <w:r>
+              <w:t>-0.057</w:t>
+            </w:r>
+          </w:p>
+        </w:tc>
+        <w:tc>
+          <w:tcPr>
+            <w:tcW w:type="dxa" w:w="1419"/>
+          </w:tcPr>
+          <w:p>
+            <w:r>
+              <w:t>0.695 / 0.517</w:t>
+            </w:r>
+          </w:p>
+        </w:tc>
+        <w:tc>
+          <w:tcPr>
+            <w:tcW w:type="dxa" w:w="1419"/>
+          </w:tcPr>
+          <w:p>
+            <w:r/>
+          </w:p>
+        </w:tc>
+        <w:tc>
+          <w:tcPr>
+            <w:tcW w:type="dxa" w:w="1419"/>
+          </w:tcPr>
+          <w:p>
+            <w:r/>
+          </w:p>
+        </w:tc>
+        <w:tc>
+          <w:tcPr>
+            <w:tcW w:type="dxa" w:w="1419"/>
+          </w:tcPr>
+          <w:p>
+            <w:r>
+              <w:t>not used for selection</w:t>
+            </w:r>
+          </w:p>
+        </w:tc>
+      </w:tr>
+      <w:tr>
+        <w:tc>
+          <w:tcPr>
+            <w:tcW w:type="dxa" w:w="1419"/>
+          </w:tcPr>
+          <w:p>
+            <w:r>
+              <w:t>Weaviate + bge-reranker-v2-m3 (12 to 4)</w:t>
+            </w:r>
+          </w:p>
+        </w:tc>
+        <w:tc>
+          <w:tcPr>
+            <w:tcW w:type="dxa" w:w="1419"/>
+          </w:tcPr>
+          <w:p>
+            <w:r>
+              <w:t>0.698</w:t>
+            </w:r>
+          </w:p>
+        </w:tc>
+        <w:tc>
+          <w:tcPr>
+            <w:tcW w:type="dxa" w:w="1419"/>
+          </w:tcPr>
+          <w:p>
+            <w:r>
+              <w:t>+0.050</w:t>
+            </w:r>
+          </w:p>
+        </w:tc>
+        <w:tc>
+          <w:tcPr>
+            <w:tcW w:type="dxa" w:w="1419"/>
+          </w:tcPr>
+          <w:p>
+            <w:r>
+              <w:t>0.736 / 0.660</w:t>
+            </w:r>
+          </w:p>
+        </w:tc>
+        <w:tc>
+          <w:tcPr>
+            <w:tcW w:type="dxa" w:w="1419"/>
+          </w:tcPr>
+          <w:p>
+            <w:r>
+              <w:t>0.610</w:t>
+            </w:r>
+          </w:p>
+        </w:tc>
+        <w:tc>
+          <w:tcPr>
+            <w:tcW w:type="dxa" w:w="1419"/>
+          </w:tcPr>
+          <w:p>
+            <w:r>
+              <w:t>2.26 s</w:t>
+            </w:r>
+          </w:p>
+        </w:tc>
+        <w:tc>
+          <w:tcPr>
+            <w:tcW w:type="dxa" w:w="1419"/>
+          </w:tcPr>
+          <w:p>
+            <w:r>
+              <w:t>passed; to stage 2</w:t>
+            </w:r>
+          </w:p>
+        </w:tc>
+      </w:tr>
+      <w:tr>
+        <w:tc>
+          <w:tcPr>
+            <w:tcW w:type="dxa" w:w="1419"/>
+          </w:tcPr>
+          <w:p>
+            <w:r>
+              <w:t>Pinecone + bge-reranker-v2-m3</w:t>
+            </w:r>
+          </w:p>
+        </w:tc>
+        <w:tc>
+          <w:tcPr>
+            <w:tcW w:type="dxa" w:w="1419"/>
+          </w:tcPr>
+          <w:p>
+            <w:r>
+              <w:t>0.504</w:t>
+            </w:r>
+          </w:p>
+        </w:tc>
+        <w:tc>
+          <w:tcPr>
+            <w:tcW w:type="dxa" w:w="1419"/>
+          </w:tcPr>
+          <w:p>
+            <w:r>
+              <w:t>-0.144</w:t>
+            </w:r>
+          </w:p>
+        </w:tc>
+        <w:tc>
+          <w:tcPr>
+            <w:tcW w:type="dxa" w:w="1419"/>
+          </w:tcPr>
+          <w:p>
+            <w:r>
+              <w:t>0.530 / 0.476</w:t>
+            </w:r>
+          </w:p>
+        </w:tc>
+        <w:tc>
+          <w:tcPr>
+            <w:tcW w:type="dxa" w:w="1419"/>
+          </w:tcPr>
+          <w:p>
+            <w:r>
+              <w:t>0.451</w:t>
+            </w:r>
+          </w:p>
+        </w:tc>
+        <w:tc>
+          <w:tcPr>
+            <w:tcW w:type="dxa" w:w="1419"/>
+          </w:tcPr>
+          <w:p>
+            <w:r>
+              <w:t>2.92 s</w:t>
+            </w:r>
+          </w:p>
+        </w:tc>
+        <w:tc>
+          <w:tcPr>
+            <w:tcW w:type="dxa" w:w="1419"/>
+          </w:tcPr>
+          <w:p>
+            <w:r>
+              <w:t>REJECT, stage 1</w:t>
+            </w:r>
+          </w:p>
+        </w:tc>
+      </w:tr>
+    </w:tbl>
+    <w:p/>
+    <w:tbl>
+      <w:tblPr>
+        <w:tblStyle w:val="LightGrid-Accent2"/>
+        <w:tblW w:type="auto" w:w="0"/>
+        <w:tblLook w:firstColumn="1" w:firstRow="1" w:lastColumn="0" w:lastRow="0" w:noHBand="0" w:noVBand="1" w:val="04A0"/>
+      </w:tblPr>
+      <w:tblGrid>
+        <w:gridCol w:w="1987"/>
+        <w:gridCol w:w="1987"/>
+        <w:gridCol w:w="1987"/>
+        <w:gridCol w:w="1987"/>
+        <w:gridCol w:w="1987"/>
+      </w:tblGrid>
+      <w:tr>
+        <w:tc>
+          <w:tcPr>
+            <w:tcW w:type="dxa" w:w="1987"/>
+          </w:tcPr>
+          <w:p>
+            <w:r>
+              <w:rPr>
+                <w:b/>
+              </w:rPr>
+              <w:t>Stage-2 gate (n = 172 per arm)</w:t>
+            </w:r>
+          </w:p>
+        </w:tc>
+        <w:tc>
+          <w:tcPr>
+            <w:tcW w:type="dxa" w:w="1987"/>
+          </w:tcPr>
+          <w:p>
+            <w:r>
+              <w:rPr>
+                <w:b/>
+              </w:rPr>
+              <w:t>Weaviate</w:t>
+            </w:r>
+          </w:p>
+        </w:tc>
+        <w:tc>
+          <w:tcPr>
+            <w:tcW w:type="dxa" w:w="1987"/>
+          </w:tcPr>
+          <w:p>
+            <w:r>
+              <w:rPr>
+                <w:b/>
+              </w:rPr>
+              <w:t>Weaviate + reranker</w:t>
+            </w:r>
+          </w:p>
+        </w:tc>
+        <w:tc>
+          <w:tcPr>
+            <w:tcW w:type="dxa" w:w="1987"/>
+          </w:tcPr>
+          <w:p>
+            <w:r>
+              <w:rPr>
+                <w:b/>
+              </w:rPr>
+              <w:t>Threshold</w:t>
+            </w:r>
+          </w:p>
+        </w:tc>
+        <w:tc>
+          <w:tcPr>
+            <w:tcW w:type="dxa" w:w="1987"/>
+          </w:tcPr>
+          <w:p>
+            <w:r>
+              <w:rPr>
+                <w:b/>
+              </w:rPr>
+              <w:t>Result</w:t>
+            </w:r>
+          </w:p>
+        </w:tc>
+      </w:tr>
+      <w:tr>
+        <w:tc>
+          <w:tcPr>
+            <w:tcW w:type="dxa" w:w="1987"/>
+          </w:tcPr>
+          <w:p>
+            <w:r>
+              <w:t>Correctness</w:t>
+            </w:r>
+          </w:p>
+        </w:tc>
+        <w:tc>
+          <w:tcPr>
+            <w:tcW w:type="dxa" w:w="1987"/>
+          </w:tcPr>
+          <w:p>
+            <w:r>
+              <w:t>0.850</w:t>
+            </w:r>
+          </w:p>
+        </w:tc>
+        <w:tc>
+          <w:tcPr>
+            <w:tcW w:type="dxa" w:w="1987"/>
+          </w:tcPr>
+          <w:p>
+            <w:r>
+              <w:t>0.799</w:t>
+            </w:r>
+          </w:p>
+        </w:tc>
+        <w:tc>
+          <w:tcPr>
+            <w:tcW w:type="dxa" w:w="1987"/>
+          </w:tcPr>
+          <w:p>
+            <w:r>
+              <w:t>+0.030 or more</w:t>
+            </w:r>
+          </w:p>
+        </w:tc>
+        <w:tc>
+          <w:tcPr>
+            <w:tcW w:type="dxa" w:w="1987"/>
+          </w:tcPr>
+          <w:p>
+            <w:r>
+              <w:t>fail</w:t>
+            </w:r>
+          </w:p>
+        </w:tc>
+      </w:tr>
+      <w:tr>
+        <w:tc>
+          <w:tcPr>
+            <w:tcW w:type="dxa" w:w="1987"/>
+          </w:tcPr>
+          <w:p>
+            <w:r>
+              <w:t>Groundedness</w:t>
+            </w:r>
+          </w:p>
+        </w:tc>
+        <w:tc>
+          <w:tcPr>
+            <w:tcW w:type="dxa" w:w="1987"/>
+          </w:tcPr>
+          <w:p>
+            <w:r>
+              <w:t>0.925</w:t>
+            </w:r>
+          </w:p>
+        </w:tc>
+        <w:tc>
+          <w:tcPr>
+            <w:tcW w:type="dxa" w:w="1987"/>
+          </w:tcPr>
+          <w:p>
+            <w:r>
+              <w:t>0.922</w:t>
+            </w:r>
+          </w:p>
+        </w:tc>
+        <w:tc>
+          <w:tcPr>
+            <w:tcW w:type="dxa" w:w="1987"/>
+          </w:tcPr>
+          <w:p>
+            <w:r>
+              <w:t>at or above reference</w:t>
+            </w:r>
+          </w:p>
+        </w:tc>
+        <w:tc>
+          <w:tcPr>
+            <w:tcW w:type="dxa" w:w="1987"/>
+          </w:tcPr>
+          <w:p>
+            <w:r>
+              <w:t>fail (flat)</w:t>
+            </w:r>
+          </w:p>
+        </w:tc>
+      </w:tr>
+      <w:tr>
+        <w:tc>
+          <w:tcPr>
+            <w:tcW w:type="dxa" w:w="1987"/>
+          </w:tcPr>
+          <w:p>
+            <w:r>
+              <w:t>Holdout correctness</w:t>
+            </w:r>
+          </w:p>
+        </w:tc>
+        <w:tc>
+          <w:tcPr>
+            <w:tcW w:type="dxa" w:w="1987"/>
+          </w:tcPr>
+          <w:p>
+            <w:r>
+              <w:t>0.828</w:t>
+            </w:r>
+          </w:p>
+        </w:tc>
+        <w:tc>
+          <w:tcPr>
+            <w:tcW w:type="dxa" w:w="1987"/>
+          </w:tcPr>
+          <w:p>
+            <w:r>
+              <w:t>0.737</w:t>
+            </w:r>
+          </w:p>
+        </w:tc>
+        <w:tc>
+          <w:tcPr>
+            <w:tcW w:type="dxa" w:w="1987"/>
+          </w:tcPr>
+          <w:p>
+            <w:r>
+              <w:t>at or above reference</w:t>
+            </w:r>
+          </w:p>
+        </w:tc>
+        <w:tc>
+          <w:tcPr>
+            <w:tcW w:type="dxa" w:w="1987"/>
+          </w:tcPr>
+          <w:p>
+            <w:r>
+              <w:t>fail</w:t>
+            </w:r>
+          </w:p>
+        </w:tc>
+      </w:tr>
+      <w:tr>
+        <w:tc>
+          <w:tcPr>
+            <w:tcW w:type="dxa" w:w="1987"/>
+          </w:tcPr>
+          <w:p>
+            <w:r>
+              <w:t>Cost per query</w:t>
+            </w:r>
+          </w:p>
+        </w:tc>
+        <w:tc>
+          <w:tcPr>
+            <w:tcW w:type="dxa" w:w="1987"/>
+          </w:tcPr>
+          <w:p>
+            <w:r>
+              <w:t>$0.0188</w:t>
+            </w:r>
+          </w:p>
+        </w:tc>
+        <w:tc>
+          <w:tcPr>
+            <w:tcW w:type="dxa" w:w="1987"/>
+          </w:tcPr>
+          <w:p>
+            <w:r>
+              <w:t>$0.0194</w:t>
+            </w:r>
+          </w:p>
+        </w:tc>
+        <w:tc>
+          <w:tcPr>
+            <w:tcW w:type="dxa" w:w="1987"/>
+          </w:tcPr>
+          <w:p>
+            <w:r>
+              <w:t>1.25x or less</w:t>
+            </w:r>
+          </w:p>
+        </w:tc>
+        <w:tc>
+          <w:tcPr>
+            <w:tcW w:type="dxa" w:w="1987"/>
+          </w:tcPr>
+          <w:p>
+            <w:r>
+              <w:t>pass</w:t>
+            </w:r>
+          </w:p>
+        </w:tc>
+      </w:tr>
+      <w:tr>
+        <w:tc>
+          <w:tcPr>
+            <w:tcW w:type="dxa" w:w="1987"/>
+          </w:tcPr>
+          <w:p>
+            <w:r>
+              <w:t>p50 latency</w:t>
+            </w:r>
+          </w:p>
+        </w:tc>
+        <w:tc>
+          <w:tcPr>
+            <w:tcW w:type="dxa" w:w="1987"/>
+          </w:tcPr>
+          <w:p>
+            <w:r>
+              <w:t>17.6 s</w:t>
+            </w:r>
+          </w:p>
+        </w:tc>
+        <w:tc>
+          <w:tcPr>
+            <w:tcW w:type="dxa" w:w="1987"/>
+          </w:tcPr>
+          <w:p>
+            <w:r>
+              <w:t>18.9 s</w:t>
+            </w:r>
+          </w:p>
+        </w:tc>
+        <w:tc>
+          <w:tcPr>
+            <w:tcW w:type="dxa" w:w="1987"/>
+          </w:tcPr>
+          <w:p>
+            <w:r>
+              <w:t>1.25x or less</w:t>
+            </w:r>
+          </w:p>
+        </w:tc>
+        <w:tc>
+          <w:tcPr>
+            <w:tcW w:type="dxa" w:w="1987"/>
+          </w:tcPr>
+          <w:p>
+            <w:r>
+              <w:t>pass</w:t>
+            </w:r>
+          </w:p>
+        </w:tc>
+      </w:tr>
+    </w:tbl>
+    <w:p/>
+    <w:p>
+      <w:pPr>
+        <w:pStyle w:val="ListBullet"/>
+      </w:pPr>
+      <w:r>
+        <w:t>Why the reranker lost: page recall in the full pipeline was flat (0.680 to 0.690) while chunk recall fell 0.657 to 0.639 and must-mention recall fell 0.603 to 0.568. Same pages, thinner chunks, answers missing required facts. Paired per question: 4 wins, 11 losses, 44 ties. Retrieval scores are not shown to any prompt, so score scale is not the cause.</w:t>
       </w:r>
     </w:p>
     <w:p>
+      <w:pPr>
+        <w:pStyle w:val="ListBullet"/>
+      </w:pPr>
       <w:r>
-        <w:rPr>
-          <w:rFonts w:ascii="Arial" w:hAnsi="Arial" w:eastAsia="Arial"/>
-          <w:b w:val="0"/>
-          <w:i w:val="0"/>
-          <w:color w:val="000000"/>
-          <w:sz w:val="22"/>
-        </w:rPr>
-        <w:t>Safety drift 0.4091; PII persistence 0.1875; emergency red-flag escalation 1.0000.</w:t>
+        <w:t>Why PageIndex lost: 79 pages across two monographs against benchmarks built on thousand-page filings. PageIndex local mode has no LLM retrieval call (only submit_document, get_tree, get_ocr), so the one-call node selector over titles and summaries was ours. It doubled retrieval latency and returned about twice the chunks.</w:t>
       </w:r>
     </w:p>
     <w:p>
+      <w:pPr>
+        <w:pStyle w:val="ListBullet"/>
+      </w:pPr>
       <w:r>
-        <w:rPr>
-          <w:rFonts w:ascii="Arial" w:hAnsi="Arial" w:eastAsia="Arial"/>
-          <w:b w:val="0"/>
-          <w:i w:val="0"/>
-          <w:color w:val="000000"/>
-          <w:sz w:val="22"/>
-        </w:rPr>
-        <w:t>Turn behavior match 0.9396; correctness 0.8072; groundedness 0.9224; context carry-over 0.8856; consistency 0.8182.</w:t>
+        <w:t>Why Pinecone lost, as configured: a convex mix of raw dot-product and raw sparse scores, where Weaviate normalises each ranking before fusing. The dense-only diagnostic isolates about 0.13 of the 0.185 loss to that choice; the rest is a dense-only index trailing lexical plus dense on holdout. It was not tuned after the fact. Normalised or RRF fusion is the named path to reopen it.</w:t>
       </w:r>
     </w:p>
     <w:p>
+      <w:pPr>
+        <w:pStyle w:val="ListBullet"/>
+      </w:pPr>
       <w:r>
-        <w:rPr>
-          <w:rFonts w:ascii="Arial" w:hAnsi="Arial" w:eastAsia="Arial"/>
-          <w:b w:val="0"/>
-          <w:i w:val="0"/>
-          <w:color w:val="000000"/>
-          <w:sz w:val="22"/>
-        </w:rPr>
-        <w:t>Total latency 101.06 seconds; cost $0.10636 per conversation.</w:t>
+        <w:t>What was kept: Weaviate hybrid search with limit 4, alpha 0.65 and relative-score fusion, the checked-in chunks, text-embedding-3-small, and every downstream stage. What changed: knobs HC_RAG_RETRIEVER (weaviate, pageindex, pinecone) and HC_RAG_RERANKER (none, pinecone), the arms and their tests (53 plus 23), make index-pageindex and make ingest-pinecone, the gate evals/pageindex_gate.py (61 tests), decision records and the evidence trail in docs/experiments/.</w:t>
+      </w:r>
+    </w:p>
+    <w:p>
+      <w:pPr>
+        <w:pStyle w:val="ListBullet"/>
+      </w:pPr>
+      <w:r>
+        <w:t>Cost of the two missions: about 28 minutes and $0.30 for PageIndex; about 2 hours 40 minutes and $10 for Pinecone plus reranker, 80 minutes of that an aborted single-threaded stage 2 before rerunning at concurrency 8 on both arms.</w:t>
       </w:r>
     </w:p>
     <w:p>
@@ -2085,51 +2610,27 @@
       </w:r>
     </w:p>
     <w:p>
+      <w:pPr>
+        <w:pStyle w:val="ListBullet"/>
+      </w:pPr>
       <w:r>
-        <w:rPr>
-          <w:rFonts w:ascii="Arial" w:hAnsi="Arial" w:eastAsia="Arial"/>
-          <w:b w:val="0"/>
-          <w:i w:val="0"/>
-          <w:color w:val="000000"/>
-          <w:sz w:val="22"/>
-        </w:rPr>
-        <w:t>Tag parity-final sits on seal f83bf2f. The frozen-surface check held from baseline to final: only the build_engine() selector block changed (amendment A3).</w:t>
+        <w:t>Tag parity-final sits on seal f83bf2f. The frozen-surface check held from baseline to final; only the build_engine() selector block changed (amendment A3).</w:t>
       </w:r>
     </w:p>
     <w:p>
+      <w:pPr>
+        <w:pStyle w:val="ListBullet"/>
+      </w:pPr>
       <w:r>
-        <w:rPr>
-          <w:rFonts w:ascii="Arial" w:hAnsi="Arial" w:eastAsia="Arial"/>
-          <w:b w:val="0"/>
-          <w:i w:val="0"/>
-          <w:color w:val="000000"/>
-          <w:sz w:val="22"/>
-        </w:rPr>
-        <w:t>Final gate versus legacy passed every check except one recorded exception (amendment A4): core.hallucinated on both-answered rows moved +0.068 against a +0.05 allowance at n=44, roughly 3 net judge flips.</w:t>
+        <w:t>Final gate against legacy passed every check except one recorded exception (amendment A4): core.hallucinated on both-answered rows moved +0.068 against a +0.05 allowance at n = 44, roughly 3 net judge flips. On byte-frozen code, 7 examples flipped this flag in both directions between runs; flagged answers carried at least 95 percent claim support; 3 claim-support calibration cases were added to the judge suite and pass.</w:t>
       </w:r>
     </w:p>
     <w:p>
+      <w:pPr>
+        <w:pStyle w:val="ListBullet"/>
+      </w:pPr>
       <w:r>
-        <w:rPr>
-          <w:rFonts w:ascii="Arial" w:hAnsi="Arial" w:eastAsia="Arial"/>
-          <w:b w:val="0"/>
-          <w:i w:val="0"/>
-          <w:color w:val="000000"/>
-          <w:sz w:val="22"/>
-        </w:rPr>
-        <w:t>A4 noise proof: on byte-frozen code, 7 examples flipped this judge flag in both directions between runs. Drivers: 3 paraphrase-noise, 1 borderline claim, 1 decomposer-verbosity outlier, and 1 case where the final run matched legacy better than the earlier run had. Flagged answers carried at least 95 percent claim support. Follow-up: 3 claim-support calibration cases added to the judge suite; all pass.</w:t>
-      </w:r>
-    </w:p>
-    <w:p>
-      <w:r>
-        <w:rPr>
-          <w:rFonts w:ascii="Arial" w:hAnsi="Arial" w:eastAsia="Arial"/>
-          <w:b w:val="0"/>
-          <w:i w:val="0"/>
-          <w:color w:val="000000"/>
-          <w:sz w:val="22"/>
-        </w:rPr>
-        <w:t>Four-way review wave: F2 code quality APPROVE with 4 should-fix findings, all since fixed. F3 runtime QA APPROVE: a real 12.8-second CLI graph run with citations; a PII query short-circuited to a clinician redirect with zero echo; Agent-Server smoke 5 of 5; wheel checks green. F4 scope fidelity APPROVE: all 159 changed paths mapped to plan todos, measurement sources untouched. F1 plan compliance initially REJECT: the gate implemented latency x1.35 while the plan text said x1.30; confirmed as a transcription error and ratified as amendment A5 (x1.35 was what was approved; final ratios x1.343 and x1.344 sit inside it).</w:t>
+        <w:t>F1 plan compliance first rejected: the gate implemented latency x1.35 while the plan text said x1.30. A transcription error, ratified as amendment A5. F2 code quality approved with 4 should-fix findings, all fixed. F3 runtime QA approved on a real 12.8 s CLI run with citations, a PII query short-circuited with zero echo, Agent-Server smoke 5 of 5. F4 scope fidelity approved: 159 changed paths mapped to plan todos, measurement sources untouched.</w:t>
       </w:r>
     </w:p>
     <w:p>
@@ -2141,51 +2642,35 @@
       </w:r>
     </w:p>
     <w:p>
+      <w:pPr>
+        <w:pStyle w:val="ListBullet"/>
+      </w:pPr>
       <w:r>
-        <w:rPr>
-          <w:rFonts w:ascii="Arial" w:hAnsi="Arial" w:eastAsia="Arial"/>
-          <w:b w:val="0"/>
-          <w:i w:val="0"/>
-          <w:color w:val="000000"/>
-          <w:sz w:val="22"/>
-        </w:rPr>
-        <w:t>Phase-2 deletion: 4,307 lines of legacy orchestrator and pipeline plumbing removed across 52 files in one revertable commit (3435caf). The LangGraph StateGraph is the only runtime; 259 tests green at the end.</w:t>
+        <w:t>Phase-2 deletion: 4,307 lines of legacy orchestrator and pipeline plumbing removed across 52 files in one revertable commit (3435caf). 259 tests green at the end of the cut; 502 on the current branch.</w:t>
       </w:r>
     </w:p>
     <w:p>
+      <w:pPr>
+        <w:pStyle w:val="ListBullet"/>
+      </w:pPr>
       <w:r>
-        <w:rPr>
-          <w:rFonts w:ascii="Arial" w:hAnsi="Arial" w:eastAsia="Arial"/>
-          <w:b w:val="0"/>
-          <w:i w:val="0"/>
-          <w:color w:val="000000"/>
-          <w:sz w:val="22"/>
-        </w:rPr>
-        <w:t>Process-owned privacy sanitizer (Presidio 2.2.364, spaCy en_core_web_sm, deterministic CA/US healthcare-ID patterns): identifiers scrubbed from query and history before safety classification, even with the gate ablated; every model-authored query sanitized at its next sink; answers and follow-ups scrubbed at finalize; model-proposed spans influence metadata but never mutate text; the engine fails closed with raw-free error codes; clinical codes (RxCUI, NDC, DIN, LOINC, SNOMED) are preserved so dosing facts survive.</w:t>
+        <w:t>Process-owned sanitizer (Presidio 2.2.364, spaCy en_core_web_sm, deterministic CA/US healthcare-ID patterns): identifiers scrubbed from query and history before classification, every model-authored query sanitized at its next sink, answers and follow-ups scrubbed at finalize, model spans never mutate text, the engine fails closed with raw-free error codes, clinical codes preserved.</w:t>
       </w:r>
     </w:p>
     <w:p>
+      <w:pPr>
+        <w:pStyle w:val="ListBullet"/>
+      </w:pPr>
       <w:r>
-        <w:rPr>
-          <w:rFonts w:ascii="Arial" w:hAnsi="Arial" w:eastAsia="Arial"/>
-          <w:b w:val="0"/>
-          <w:i w:val="0"/>
-          <w:color w:val="000000"/>
-          <w:sz w:val="22"/>
-        </w:rPr>
-        <w:t>Safe Harbor used as a coverage inventory, not a compliance claim: 15 of 18 categories covered or deliberately diverged (cue-gated dates), 2 not applicable to a text pipeline, 1 inherently heuristic. The vehicle-identifier gap was found by this audit and closed with a cue-bound VIN/plate pattern and clinical-text negative tests (platelet count must not fire).</w:t>
+        <w:t>Safe Harbor used as a coverage inventory, not a compliance claim: 15 of 18 categories covered or deliberately diverged, 2 not applicable to text, 1 inherently heuristic. The vehicle-identifier gap was found by this audit and closed with a cue-bound pattern and clinical-text negative tests.</w:t>
       </w:r>
     </w:p>
     <w:p>
+      <w:pPr>
+        <w:pStyle w:val="ListBullet"/>
+      </w:pPr>
       <w:r>
-        <w:rPr>
-          <w:rFonts w:ascii="Arial" w:hAnsi="Arial" w:eastAsia="Arial"/>
-          <w:b w:val="0"/>
-          <w:i w:val="0"/>
-          <w:color w:val="000000"/>
-          <w:sz w:val="22"/>
-        </w:rPr>
-        <w:t>Safety-category eval after hardening (35 rows): behavior match 0.886 unchanged; forbidden content 0.0; numeric advice leak 0.04; false-premise correction 1.0, all identical. Hallucinated improved 0.643 to 0.538. The single safe-redirect dip (0.68 to 0.64) traced to a judge flip on a byte-identical deterministic refusal template.</w:t>
+        <w:t>Safety-category eval after hardening (35 rows): behavior match 0.886, forbidden content 0.0, advice leak 0.04, false-premise correction 1.0, all identical; hallucinated improved 0.643 to 0.538. The single safe-redirect dip (0.68 to 0.64) traced to a judge flip on a byte-identical refusal template.</w:t>
       </w:r>
     </w:p>
     <w:p>
@@ -2193,99 +2678,39 @@
         <w:pStyle w:val="Heading2"/>
       </w:pPr>
       <w:r>
-        <w:t>Shipped state</w:t>
-      </w:r>
-    </w:p>
-    <w:p>
-      <w:r>
-        <w:rPr>
-          <w:rFonts w:ascii="Arial" w:hAnsi="Arial" w:eastAsia="Arial"/>
-          <w:b w:val="0"/>
-          <w:i w:val="0"/>
-          <w:color w:val="000000"/>
-          <w:sz w:val="22"/>
-        </w:rPr>
-        <w:t>Final parity on the release code: correctness 0.853 versus legacy 0.813; answered 1.00; zero pipeline errors.</w:t>
-      </w:r>
-    </w:p>
-    <w:p>
-      <w:r>
-        <w:rPr>
-          <w:rFonts w:ascii="Arial" w:hAnsi="Arial" w:eastAsia="Arial"/>
-          <w:b w:val="0"/>
-          <w:i w:val="0"/>
-          <w:color w:val="000000"/>
-          <w:sz w:val="22"/>
-        </w:rPr>
-        <w:t>Best multi-turn graph run: turn correctness 0.807; consistency 0.818; self-contradiction 0.227; forbidden content 0.000.</w:t>
-      </w:r>
-    </w:p>
-    <w:p>
-      <w:r>
-        <w:rPr>
-          <w:rFonts w:ascii="Arial" w:hAnsi="Arial" w:eastAsia="Arial"/>
-          <w:b w:val="0"/>
-          <w:i w:val="0"/>
-          <w:color w:val="000000"/>
-          <w:sz w:val="22"/>
-        </w:rPr>
-        <w:t>Validator cost accepted as-is by explicit decision D15: roughly 90 percent of pipeline spend and 5 seconds p50. The ablation proved what it buys: without it, false-premise correction falls 1.0 to 0.875 and hallucinated rises 0.08. If cost ever matters, the lever is a cheaper validator (smaller model, batched verification), never removal.</w:t>
-      </w:r>
-    </w:p>
-    <w:p>
-      <w:r>
-        <w:rPr>
-          <w:rFonts w:ascii="Arial" w:hAnsi="Arial" w:eastAsia="Arial"/>
-          <w:b w:val="0"/>
-          <w:i w:val="0"/>
-          <w:color w:val="000000"/>
-          <w:sz w:val="22"/>
-        </w:rPr>
-        <w:t>Audit trail in the repository: journey T21-T24; decisions D01-D15; findings F25-F37; both parity tags pushed; every claim maps to a committed report.</w:t>
+        <w:t>Accepted cost and open items</w:t>
       </w:r>
     </w:p>
     <w:p>
       <w:pPr>
-        <w:pStyle w:val="Heading2"/>
+        <w:pStyle w:val="ListBullet"/>
       </w:pPr>
       <w:r>
-        <w:t>Next actions</w:t>
+        <w:t>Validator cost accepted as-is by decision D15: about 90 percent of pipeline spend and 5 s of p50. Without it, false-premise correction falls 1.0 to 0.875 and hallucinated rises 0.08. If cost ever matters, use a cheaper validator model or batched verification. Do not remove it.</w:t>
       </w:r>
     </w:p>
     <w:p>
+      <w:pPr>
+        <w:pStyle w:val="ListBullet"/>
+      </w:pPr>
       <w:r>
-        <w:rPr>
-          <w:rFonts w:ascii="Arial" w:hAnsi="Arial" w:eastAsia="Arial"/>
-          <w:b w:val="0"/>
-          <w:i w:val="0"/>
-          <w:color w:val="000000"/>
-          <w:sz w:val="22"/>
-        </w:rPr>
-        <w:t>Persist refusal state across turns so repeated pressure cannot reopen a closed safety boundary; safety drift 0.409 still trails the pre-graph 0.364.</w:t>
+        <w:t>Multi-turn: rerun the boundary evaluation with more conversations before quoting 0.27 outside; the 95% interval is wide at n = 22.</w:t>
       </w:r>
     </w:p>
     <w:p>
+      <w:pPr>
+        <w:pStyle w:val="ListBullet"/>
+      </w:pPr>
       <w:r>
-        <w:rPr>
-          <w:rFonts w:ascii="Arial" w:hAnsi="Arial" w:eastAsia="Arial"/>
-          <w:b w:val="0"/>
-          <w:i w:val="0"/>
-          <w:color w:val="000000"/>
-          <w:sz w:val="22"/>
-        </w:rPr>
-        <w:t>Run paired repetitions and treat differences within roughly plus or minus 0.05 as noise until they repeat.</w:t>
+        <w:t>Retrieval: normalised fusion for Pinecone and an alpha/limit sweep on Weaviate, both through evals/pageindex_gate.py. Rotate PINECONE_API_KEY; delete the healthcare-rag Pinecone index if no reruns are planned.</w:t>
       </w:r>
     </w:p>
     <w:p>
+      <w:pPr>
+        <w:pStyle w:val="ListBullet"/>
+      </w:pPr>
       <w:r>
-        <w:rPr>
-          <w:rFonts w:ascii="Arial" w:hAnsi="Arial" w:eastAsia="Arial"/>
-          <w:b w:val="0"/>
-          <w:i w:val="0"/>
-          <w:color w:val="000000"/>
-          <w:sz w:val="22"/>
-        </w:rPr>
-        <w:t>If validator cost ever matters, move to a cheaper validator model or batched verification; the guardrail itself stays (D15).</w:t>
+        <w:t>Evals: LangSmith is over its monthly trace quota; local rows stay authoritative, experiment links are empty until it resets.</w:t>
       </w:r>
     </w:p>
     <w:p>
@@ -2297,128 +2722,96 @@
       </w:r>
     </w:p>
     <w:p>
+      <w:pPr>
+        <w:pStyle w:val="ListBullet"/>
+      </w:pPr>
       <w:r>
-        <w:rPr>
-          <w:rFonts w:ascii="Arial" w:hAnsi="Arial" w:eastAsia="Arial"/>
-          <w:b w:val="0"/>
-          <w:i w:val="0"/>
-          <w:color w:val="555555"/>
-          <w:sz w:val="20"/>
-        </w:rPr>
         <w:t>Assignment context: nymble - Technical Exercise - Senior Python Engineer.pdf</w:t>
       </w:r>
     </w:p>
     <w:p>
+      <w:pPr>
+        <w:pStyle w:val="ListBullet"/>
+      </w:pPr>
       <w:r>
-        <w:rPr>
-          <w:rFonts w:ascii="Arial" w:hAnsi="Arial" w:eastAsia="Arial"/>
-          <w:b w:val="0"/>
-          <w:i w:val="0"/>
-          <w:color w:val="555555"/>
-          <w:sz w:val="20"/>
-        </w:rPr>
-        <w:t>Journey, decisions, findings (canonical): docs/journey.json</w:t>
+        <w:t>Journey, decisions, findings (canonical): docs/journey.json (D01 to D17, F01 to F42, T01 to T26)</w:t>
       </w:r>
     </w:p>
     <w:p>
+      <w:pPr>
+        <w:pStyle w:val="ListBullet"/>
+      </w:pPr>
       <w:r>
-        <w:rPr>
-          <w:rFonts w:ascii="Arial" w:hAnsi="Arial" w:eastAsia="Arial"/>
-          <w:b w:val="0"/>
-          <w:i w:val="0"/>
-          <w:color w:val="555555"/>
-          <w:sz w:val="20"/>
-        </w:rPr>
-        <w:t>Parity and final gate: docs/baseline-report.md sections 9-10</w:t>
+        <w:t>Parity and final gate: docs/baseline-report.md sections 9 and 10</w:t>
       </w:r>
     </w:p>
     <w:p>
+      <w:pPr>
+        <w:pStyle w:val="ListBullet"/>
+      </w:pPr>
       <w:r>
-        <w:rPr>
-          <w:rFonts w:ascii="Arial" w:hAnsi="Arial" w:eastAsia="Arial"/>
-          <w:b w:val="0"/>
-          <w:i w:val="0"/>
-          <w:color w:val="555555"/>
-          <w:sz w:val="20"/>
-        </w:rPr>
-        <w:t>Graph-final single-turn: evals/results/graph-final-c3337bb0-report.md and graph-final-c3337bb0.json</w:t>
+        <w:t>Graph-final single-turn: evals/results/graph-final-c3337bb0-report.md and .json</w:t>
       </w:r>
     </w:p>
     <w:p>
+      <w:pPr>
+        <w:pStyle w:val="ListBullet"/>
+      </w:pPr>
       <w:r>
-        <w:rPr>
-          <w:rFonts w:ascii="Arial" w:hAnsi="Arial" w:eastAsia="Arial"/>
-          <w:b w:val="0"/>
-          <w:i w:val="0"/>
-          <w:color w:val="555555"/>
-          <w:sz w:val="20"/>
-        </w:rPr>
-        <w:t>Graph-final exact-commit multi-turn: evals/results/multiturn-graph-final-a7e609e7.md and multiturn-graph-final-a7e609e7.json</w:t>
+        <w:t>Graph-final multi-turn: evals/results/multiturn-graph-final-a7e609e7.md and .json</w:t>
       </w:r>
     </w:p>
     <w:p>
+      <w:pPr>
+        <w:pStyle w:val="ListBullet"/>
+      </w:pPr>
       <w:r>
-        <w:rPr>
-          <w:rFonts w:ascii="Arial" w:hAnsi="Arial" w:eastAsia="Arial"/>
-          <w:b w:val="0"/>
-          <w:i w:val="0"/>
-          <w:color w:val="555555"/>
-          <w:sz w:val="20"/>
-        </w:rPr>
-        <w:t>Comparable synthesis run: evals/results/synth-full-f7ca9e15-report.md and synth-full-f7ca9e15.json</w:t>
+        <w:t>Persisted refusal boundary: docs/safety.md (section Persisted refusal boundary); evals/results/boundary-verdict/verdict.md; evals/results/boundary-on-r4-aeb73d36.md</w:t>
       </w:r>
     </w:p>
     <w:p>
+      <w:pPr>
+        <w:pStyle w:val="ListBullet"/>
+      </w:pPr>
       <w:r>
-        <w:rPr>
-          <w:rFonts w:ascii="Arial" w:hAnsi="Arial" w:eastAsia="Arial"/>
-          <w:b w:val="0"/>
-          <w:i w:val="0"/>
-          <w:color w:val="555555"/>
-          <w:sz w:val="20"/>
-        </w:rPr>
-        <w:t>Pre-graph safety run: evals/results/safety-pregraph-full-b46acc33-report.md and safety-pregraph-full-b46acc33.json</w:t>
+        <w:t>Comparable synthesis run: evals/results/synth-full-f7ca9e15-report.md; pre-graph safety run: evals/results/safety-pregraph-full-b46acc33-report.md; graph parity: evals/results/graph-parity-a733f3d0-report.md</w:t>
       </w:r>
     </w:p>
     <w:p>
+      <w:pPr>
+        <w:pStyle w:val="ListBullet"/>
+      </w:pPr>
       <w:r>
-        <w:rPr>
-          <w:rFonts w:ascii="Arial" w:hAnsi="Arial" w:eastAsia="Arial"/>
-          <w:b w:val="0"/>
-          <w:i w:val="0"/>
-          <w:color w:val="555555"/>
-          <w:sz w:val="20"/>
-        </w:rPr>
-        <w:t>Graph parity: evals/results/graph-parity-a733f3d0-report.md and graph-parity-a733f3d0.json</w:t>
-      </w:r>
-    </w:p>
-    <w:p>
-      <w:r>
-        <w:rPr>
-          <w:rFonts w:ascii="Arial" w:hAnsi="Arial" w:eastAsia="Arial"/>
-          <w:b w:val="0"/>
-          <w:i w:val="0"/>
-          <w:color w:val="555555"/>
-          <w:sz w:val="20"/>
-        </w:rPr>
         <w:t>Ablations: evals/results/abl-graph-stages-report.md</w:t>
       </w:r>
     </w:p>
     <w:p>
+      <w:pPr>
+        <w:pStyle w:val="ListBullet"/>
+      </w:pPr>
       <w:r>
-        <w:rPr>
-          <w:rFonts w:ascii="Arial" w:hAnsi="Arial" w:eastAsia="Arial"/>
-          <w:b w:val="0"/>
-          <w:i w:val="0"/>
-          <w:color w:val="555555"/>
-          <w:sz w:val="20"/>
-        </w:rPr>
-        <w:t>Privacy hardening: evals/results/priv-sanitizer-safety-ca3da172.md; docs/safety.md (Safe Harbor inventory); deletion commit 3435caf</w:t>
+        <w:t>Privacy hardening: evals/results/priv-sanitizer-safety-ca3da172.md; docs/safety.md; deletion commit 3435caf</w:t>
+      </w:r>
+    </w:p>
+    <w:p>
+      <w:pPr>
+        <w:pStyle w:val="ListBullet"/>
+      </w:pPr>
+      <w:r>
+        <w:t>Retrieval experiments: docs/retrieval-experiments.md; docs/decisions/pageindex-vs-weaviate.md; docs/decisions/pinecone-rerank.md; evals/results/pinecone-rerank.md, pinecone-rerank-stage2.md, pinecone-dense-diag.md, pi-gate-weaviate-89bc4ed3.md, pi-gate-weaviate-rerank-606da650.md; docs/experiments/ (deep-interview spec, missions, evaluator contracts, decision logs, per-iteration JSON)</w:t>
+      </w:r>
+    </w:p>
+    <w:p>
+      <w:pPr>
+        <w:pStyle w:val="ListBullet"/>
+      </w:pPr>
+      <w:r>
+        <w:t>Gate and arms: evals/pageindex_gate.py; healthcare_rag/processors/{pageindex_retrieval,pinecone_retrieval,rerank}.py; healthcare_rag/graph/nodes/retrieve.py</w:t>
       </w:r>
     </w:p>
     <w:sectPr>
       <w:pgSz w:w="12240" w:h="15840"/>
-      <w:pgMar w:top="1440" w:right="1440" w:bottom="1440" w:left="1440" w:header="708" w:footer="708" w:gutter="0"/>
+      <w:pgMar w:top="1008" w:right="1152" w:bottom="1008" w:left="1152" w:header="720" w:footer="720" w:gutter="0"/>
       <w:cols w:space="720"/>
       <w:docGrid w:linePitch="360"/>
     </w:sectPr>
@@ -2789,12 +3182,8 @@
     <w:name w:val="Normal"/>
     <w:qFormat/>
     <w:rsid w:val="00FC693F"/>
-    <w:pPr>
-      <w:spacing w:before="0" w:after="160" w:line="276" w:lineRule="auto"/>
-    </w:pPr>
     <w:rPr>
-      <w:rFonts w:ascii="Arial" w:hAnsi="Arial" w:eastAsia="Arial"/>
-      <w:color w:val="000000"/>
+      <w:rFonts w:ascii="Arial" w:hAnsi="Arial"/>
       <w:sz w:val="22"/>
     </w:rPr>
   </w:style>
@@ -2853,15 +3242,15 @@
     <w:pPr>
       <w:keepNext/>
       <w:keepLines/>
-      <w:spacing w:before="400" w:after="120" w:line="276" w:lineRule="auto"/>
+      <w:spacing w:before="480" w:after="0"/>
       <w:outlineLvl w:val="0"/>
     </w:pPr>
     <w:rPr>
-      <w:rFonts w:asciiTheme="majorHAnsi" w:eastAsiaTheme="majorEastAsia" w:hAnsiTheme="majorHAnsi" w:cstheme="majorBidi" w:ascii="Arial" w:hAnsi="Arial" w:eastAsia="Arial"/>
-      <w:b w:val="0"/>
+      <w:rFonts w:asciiTheme="majorHAnsi" w:eastAsiaTheme="majorEastAsia" w:hAnsiTheme="majorHAnsi" w:cstheme="majorBidi"/>
+      <w:b/>
       <w:bCs/>
-      <w:color w:val="000000"/>
-      <w:sz w:val="40"/>
+      <w:color w:val="365F91" w:themeColor="accent1" w:themeShade="BF"/>
+      <w:sz w:val="28"/>
       <w:szCs w:val="28"/>
     </w:rPr>
   </w:style>
@@ -2877,15 +3266,15 @@
     <w:pPr>
       <w:keepNext/>
       <w:keepLines/>
-      <w:spacing w:before="360" w:after="120" w:line="276" w:lineRule="auto"/>
+      <w:spacing w:before="200" w:after="0"/>
       <w:outlineLvl w:val="1"/>
     </w:pPr>
     <w:rPr>
-      <w:rFonts w:asciiTheme="majorHAnsi" w:eastAsiaTheme="majorEastAsia" w:hAnsiTheme="majorHAnsi" w:cstheme="majorBidi" w:ascii="Arial" w:hAnsi="Arial" w:eastAsia="Arial"/>
-      <w:b w:val="0"/>
+      <w:rFonts w:asciiTheme="majorHAnsi" w:eastAsiaTheme="majorEastAsia" w:hAnsiTheme="majorHAnsi" w:cstheme="majorBidi"/>
+      <w:b/>
       <w:bCs/>
-      <w:color w:val="000000"/>
-      <w:sz w:val="32"/>
+      <w:color w:val="4F81BD" w:themeColor="accent1"/>
+      <w:sz w:val="26"/>
       <w:szCs w:val="26"/>
     </w:rPr>
   </w:style>
@@ -2901,15 +3290,14 @@
     <w:pPr>
       <w:keepNext/>
       <w:keepLines/>
-      <w:spacing w:before="320" w:after="80" w:line="276" w:lineRule="auto"/>
+      <w:spacing w:before="200" w:after="0"/>
       <w:outlineLvl w:val="2"/>
     </w:pPr>
     <w:rPr>
-      <w:rFonts w:asciiTheme="majorHAnsi" w:eastAsiaTheme="majorEastAsia" w:hAnsiTheme="majorHAnsi" w:cstheme="majorBidi" w:ascii="Arial" w:hAnsi="Arial" w:eastAsia="Arial"/>
-      <w:b w:val="0"/>
+      <w:rFonts w:asciiTheme="majorHAnsi" w:eastAsiaTheme="majorEastAsia" w:hAnsiTheme="majorHAnsi" w:cstheme="majorBidi"/>
+      <w:b/>
       <w:bCs/>
-      <w:color w:val="434343"/>
-      <w:sz w:val="28"/>
+      <w:color w:val="4F81BD" w:themeColor="accent1"/>
     </w:rPr>
   </w:style>
   <w:style w:type="paragraph" w:styleId="Heading4">

</xml_diff>